<commit_message>
Überarbeitung: helleres Design, Bilder, größere Schrift, Fachleute-Botschaft
- Foliensatz neu: frische grüne Palette, Foto-Hintergründe (Titel/Trenner) und
  Themenbilder (Erkrankungen), größere Schrift, saubere Ausrichtung; neue Folie
  „Fachleute sind Verbündete – kein Feind / Hilfe annehmen ist Stärke“ (40 Folien)
- Trainerhandbuch & Arbeitsblätter: hellere Palette, größere Schrift, Titelbanner,
  Foliennummern angepasst; Fachleute-Botschaft ergänzt
- Neues PDF-Infoblatt mit Hero-Bild, Fachleute-Abschnitt, größerer Schrift
- README aktualisiert (40 Folien, PDF, Bild-Lizenzhinweis)

Co-Authored-By: Claude Opus 4.8 <noreply@anthropic.com>
Claude-Session: https://claude.ai/code/session_01GYepHDnc6PQdCAJVNphDNw
</commit_message>
<xml_diff>
--- a/workshop-psychische-gesundheit/Arbeitsblaetter_Kopiervorlagen.docx
+++ b/workshop-psychische-gesundheit/Arbeitsblaetter_Kopiervorlagen.docx
@@ -4,14 +4,59 @@
   <w:body>
     <w:p>
       <w:pPr>
-        <w:spacing w:after="0" w:before="1600"/>
+        <w:spacing w:after="260" w:before="400"/>
+      </w:pPr>
+      <w:r>
+        <w:drawing>
+          <wp:inline distT="0" distB="0" distL="0" distR="0">
+            <wp:extent cx="5715000" cy="1381125"/>
+            <wp:effectExtent t="0" r="0" b="0" l="0"/>
+            <wp:docPr id="1" name="" descr="" title=""/>
+            <wp:cNvGraphicFramePr>
+              <a:graphicFrameLocks xmlns:a="http://schemas.openxmlformats.org/drawingml/2006/main" noChangeAspect="1"/>
+            </wp:cNvGraphicFramePr>
+            <a:graphic xmlns:a="http://schemas.openxmlformats.org/drawingml/2006/main">
+              <a:graphicData uri="http://schemas.openxmlformats.org/drawingml/2006/picture">
+                <pic:pic xmlns:pic="http://schemas.openxmlformats.org/drawingml/2006/picture">
+                  <pic:nvPicPr>
+                    <pic:cNvPr id="0" name="" descr=""/>
+                    <pic:cNvPicPr>
+                      <a:picLocks noChangeAspect="1" noChangeArrowheads="1"/>
+                    </pic:cNvPicPr>
+                  </pic:nvPicPr>
+                  <pic:blipFill>
+                    <a:blip r:embed="rId9" cstate="none"/>
+                    <a:srcRect/>
+                    <a:stretch>
+                      <a:fillRect/>
+                    </a:stretch>
+                  </pic:blipFill>
+                  <pic:spPr bwMode="auto">
+                    <a:xfrm>
+                      <a:off x="0" y="0"/>
+                      <a:ext cx="5715000" cy="1381125"/>
+                    </a:xfrm>
+                    <a:prstGeom prst="rect">
+                      <a:avLst/>
+                    </a:prstGeom>
+                  </pic:spPr>
+                </pic:pic>
+              </a:graphicData>
+            </a:graphic>
+          </wp:inline>
+        </w:drawing>
+      </w:r>
+    </w:p>
+    <w:p>
+      <w:pPr>
+        <w:spacing w:after="0" w:before="0"/>
       </w:pPr>
       <w:r>
         <w:rPr>
           <w:rFonts w:ascii="Calibri" w:cs="Calibri" w:eastAsia="Calibri" w:hAnsi="Calibri"/>
           <w:b/>
           <w:bCs/>
-          <w:color w:val="3F7C79"/>
+          <w:color w:val="2E9284"/>
           <w:sz w:val="22"/>
           <w:szCs w:val="22"/>
         </w:rPr>
@@ -27,7 +72,7 @@
           <w:rFonts w:ascii="Cambria" w:cs="Cambria" w:eastAsia="Cambria" w:hAnsi="Cambria"/>
           <w:b/>
           <w:bCs/>
-          <w:color w:val="2E4A52"/>
+          <w:color w:val="2C7A6B"/>
           <w:sz w:val="60"/>
           <w:szCs w:val="60"/>
         </w:rPr>
@@ -43,7 +88,7 @@
           <w:rFonts w:ascii="Cambria" w:cs="Cambria" w:eastAsia="Cambria" w:hAnsi="Cambria"/>
           <w:b/>
           <w:bCs/>
-          <w:color w:val="2E4A52"/>
+          <w:color w:val="2C7A6B"/>
           <w:sz w:val="60"/>
           <w:szCs w:val="60"/>
         </w:rPr>
@@ -59,7 +104,7 @@
           <w:rFonts w:ascii="Cambria" w:cs="Cambria" w:eastAsia="Cambria" w:hAnsi="Cambria"/>
           <w:i/>
           <w:iCs/>
-          <w:color w:val="3F7C79"/>
+          <w:color w:val="2E9284"/>
           <w:sz w:val="26"/>
           <w:szCs w:val="26"/>
         </w:rPr>
@@ -69,7 +114,7 @@
     <w:p>
       <w:pPr>
         <w:pBdr>
-          <w:top w:val="single" w:color="DCE6E3" w:sz="8" w:space="8"/>
+          <w:top w:val="single" w:color="D9E9E1" w:sz="8" w:space="8"/>
         </w:pBdr>
         <w:spacing w:after="200" w:before="200"/>
       </w:pPr>
@@ -81,9 +126,9 @@
       <w:r>
         <w:rPr>
           <w:rFonts w:ascii="Calibri" w:cs="Calibri" w:eastAsia="Calibri" w:hAnsi="Calibri"/>
-          <w:color w:val="233139"/>
-          <w:sz w:val="21"/>
-          <w:szCs w:val="21"/>
+          <w:color w:val="23423C"/>
+          <w:sz w:val="23"/>
+          <w:szCs w:val="23"/>
         </w:rPr>
         <w:t xml:space="preserve">Alle Vorlagen sind zum Ausdrucken und Kopieren gedacht. Kopieren Sie in Klassenstärke (Teilnehmerzahl + Reserve). Die gestrichelten Karten können ausgeschnitten werden.</w:t>
       </w:r>
@@ -97,7 +142,7 @@
           <w:rFonts w:ascii="Cambria" w:cs="Cambria" w:eastAsia="Cambria" w:hAnsi="Cambria"/>
           <w:b/>
           <w:bCs/>
-          <w:color w:val="B9793B"/>
+          <w:color w:val="BC722A"/>
           <w:sz w:val="22"/>
           <w:szCs w:val="22"/>
         </w:rPr>
@@ -116,9 +161,9 @@
       <w:r>
         <w:rPr>
           <w:rFonts w:ascii="Calibri" w:cs="Calibri" w:eastAsia="Calibri" w:hAnsi="Calibri"/>
-          <w:color w:val="233139"/>
-          <w:sz w:val="21"/>
-          <w:szCs w:val="21"/>
+          <w:color w:val="23423C"/>
+          <w:sz w:val="23"/>
+          <w:szCs w:val="23"/>
         </w:rPr>
         <w:t xml:space="preserve">A1  Teilnehmer-Handout: Kernbotschaften &amp; Bilder</w:t>
       </w:r>
@@ -135,9 +180,9 @@
       <w:r>
         <w:rPr>
           <w:rFonts w:ascii="Calibri" w:cs="Calibri" w:eastAsia="Calibri" w:hAnsi="Calibri"/>
-          <w:color w:val="233139"/>
-          <w:sz w:val="21"/>
-          <w:szCs w:val="21"/>
+          <w:color w:val="23423C"/>
+          <w:sz w:val="23"/>
+          <w:szCs w:val="23"/>
         </w:rPr>
         <w:t xml:space="preserve">A2  Perspektivkarte „Ein Tag mit Depression“</w:t>
       </w:r>
@@ -154,9 +199,9 @@
       <w:r>
         <w:rPr>
           <w:rFonts w:ascii="Calibri" w:cs="Calibri" w:eastAsia="Calibri" w:hAnsi="Calibri"/>
-          <w:color w:val="233139"/>
-          <w:sz w:val="21"/>
-          <w:szCs w:val="21"/>
+          <w:color w:val="23423C"/>
+          <w:sz w:val="23"/>
+          <w:szCs w:val="23"/>
         </w:rPr>
         <w:t xml:space="preserve">A3  Mythos oder Wahrheit? – Aussagen &amp; Auflösung</w:t>
       </w:r>
@@ -173,9 +218,9 @@
       <w:r>
         <w:rPr>
           <w:rFonts w:ascii="Calibri" w:cs="Calibri" w:eastAsia="Calibri" w:hAnsi="Calibri"/>
-          <w:color w:val="233139"/>
-          <w:sz w:val="21"/>
-          <w:szCs w:val="21"/>
+          <w:color w:val="23423C"/>
+          <w:sz w:val="23"/>
+          <w:szCs w:val="23"/>
         </w:rPr>
         <w:t xml:space="preserve">A4  Rollenspiel: Situationskarten</w:t>
       </w:r>
@@ -192,9 +237,9 @@
       <w:r>
         <w:rPr>
           <w:rFonts w:ascii="Calibri" w:cs="Calibri" w:eastAsia="Calibri" w:hAnsi="Calibri"/>
-          <w:color w:val="233139"/>
-          <w:sz w:val="21"/>
-          <w:szCs w:val="21"/>
+          <w:color w:val="23423C"/>
+          <w:sz w:val="23"/>
+          <w:szCs w:val="23"/>
         </w:rPr>
         <w:t xml:space="preserve">A5  Rollenspiel: Beobachtungsbogen</w:t>
       </w:r>
@@ -211,9 +256,9 @@
       <w:r>
         <w:rPr>
           <w:rFonts w:ascii="Calibri" w:cs="Calibri" w:eastAsia="Calibri" w:hAnsi="Calibri"/>
-          <w:color w:val="233139"/>
-          <w:sz w:val="21"/>
-          <w:szCs w:val="21"/>
+          <w:color w:val="23423C"/>
+          <w:sz w:val="23"/>
+          <w:szCs w:val="23"/>
         </w:rPr>
         <w:t xml:space="preserve">A6  Fallbeispiele für Kleingruppen</w:t>
       </w:r>
@@ -230,9 +275,9 @@
       <w:r>
         <w:rPr>
           <w:rFonts w:ascii="Calibri" w:cs="Calibri" w:eastAsia="Calibri" w:hAnsi="Calibri"/>
-          <w:color w:val="233139"/>
-          <w:sz w:val="21"/>
-          <w:szCs w:val="21"/>
+          <w:color w:val="23423C"/>
+          <w:sz w:val="23"/>
+          <w:szCs w:val="23"/>
         </w:rPr>
         <w:t xml:space="preserve">A7  Körpersprache erkennen</w:t>
       </w:r>
@@ -249,9 +294,9 @@
       <w:r>
         <w:rPr>
           <w:rFonts w:ascii="Calibri" w:cs="Calibri" w:eastAsia="Calibri" w:hAnsi="Calibri"/>
-          <w:color w:val="233139"/>
-          <w:sz w:val="21"/>
-          <w:szCs w:val="21"/>
+          <w:color w:val="23423C"/>
+          <w:sz w:val="23"/>
+          <w:szCs w:val="23"/>
         </w:rPr>
         <w:t xml:space="preserve">A8  Ampelübung: Belastung einschätzen</w:t>
       </w:r>
@@ -268,9 +313,9 @@
       <w:r>
         <w:rPr>
           <w:rFonts w:ascii="Calibri" w:cs="Calibri" w:eastAsia="Calibri" w:hAnsi="Calibri"/>
-          <w:color w:val="233139"/>
-          <w:sz w:val="21"/>
-          <w:szCs w:val="21"/>
+          <w:color w:val="23423C"/>
+          <w:sz w:val="23"/>
+          <w:szCs w:val="23"/>
         </w:rPr>
         <w:t xml:space="preserve">A9  Reflexionsbogen</w:t>
       </w:r>
@@ -287,9 +332,9 @@
       <w:r>
         <w:rPr>
           <w:rFonts w:ascii="Calibri" w:cs="Calibri" w:eastAsia="Calibri" w:hAnsi="Calibri"/>
-          <w:color w:val="233139"/>
-          <w:sz w:val="21"/>
-          <w:szCs w:val="21"/>
+          <w:color w:val="23423C"/>
+          <w:sz w:val="23"/>
+          <w:szCs w:val="23"/>
         </w:rPr>
         <w:t xml:space="preserve">A10 Anlaufstellen in Österreich (zum Mitnehmen)</w:t>
       </w:r>
@@ -314,9 +359,9 @@
       <w:r>
         <w:rPr>
           <w:rFonts w:ascii="Calibri" w:cs="Calibri" w:eastAsia="Calibri" w:hAnsi="Calibri"/>
-          <w:color w:val="233139"/>
-          <w:sz w:val="21"/>
-          <w:szCs w:val="21"/>
+          <w:color w:val="23423C"/>
+          <w:sz w:val="23"/>
+          <w:szCs w:val="23"/>
         </w:rPr>
         <w:t xml:space="preserve">Zum Mitnehmen. Die wichtigsten Gedanken und Bilder aus dem Workshop auf einen Blick.</w:t>
       </w:r>
@@ -333,12 +378,12 @@
       <w:tblPr>
         <w:tblW w:type="dxa" w:w="9360"/>
         <w:tblBorders>
-          <w:top w:val="single" w:color="DCE6E3" w:sz="2"/>
-          <w:left w:val="single" w:color="DCE6E3" w:sz="2"/>
-          <w:bottom w:val="single" w:color="DCE6E3" w:sz="2"/>
-          <w:right w:val="single" w:color="DCE6E3" w:sz="2"/>
-          <w:insideH w:val="single" w:color="DCE6E3" w:sz="2"/>
-          <w:insideV w:val="single" w:color="DCE6E3" w:sz="2"/>
+          <w:top w:val="single" w:color="D9E9E1" w:sz="2"/>
+          <w:left w:val="single" w:color="D9E9E1" w:sz="2"/>
+          <w:bottom w:val="single" w:color="D9E9E1" w:sz="2"/>
+          <w:right w:val="single" w:color="D9E9E1" w:sz="2"/>
+          <w:insideH w:val="single" w:color="D9E9E1" w:sz="2"/>
+          <w:insideV w:val="single" w:color="D9E9E1" w:sz="2"/>
         </w:tblBorders>
       </w:tblPr>
       <w:tblGrid>
@@ -353,7 +398,7 @@
         <w:tc>
           <w:tcPr>
             <w:tcW w:type="dxa" w:w="2000"/>
-            <w:shd w:fill="2E4A52" w:color="auto" w:val="clear"/>
+            <w:shd w:fill="2C7A6B" w:color="auto" w:val="clear"/>
             <w:tcMar>
               <w:top w:type="dxa" w:w="80"/>
               <w:left w:type="dxa" w:w="120"/>
@@ -371,8 +416,8 @@
                 <w:b/>
                 <w:bCs/>
                 <w:color w:val="FFFFFF"/>
-                <w:sz w:val="20"/>
-                <w:szCs w:val="20"/>
+                <w:sz w:val="21"/>
+                <w:szCs w:val="21"/>
               </w:rPr>
               <w:t xml:space="preserve">Erkrankung</w:t>
             </w:r>
@@ -381,7 +426,7 @@
         <w:tc>
           <w:tcPr>
             <w:tcW w:type="dxa" w:w="3000"/>
-            <w:shd w:fill="2E4A52" w:color="auto" w:val="clear"/>
+            <w:shd w:fill="2C7A6B" w:color="auto" w:val="clear"/>
             <w:tcMar>
               <w:top w:type="dxa" w:w="80"/>
               <w:left w:type="dxa" w:w="120"/>
@@ -399,8 +444,8 @@
                 <w:b/>
                 <w:bCs/>
                 <w:color w:val="FFFFFF"/>
-                <w:sz w:val="20"/>
-                <w:szCs w:val="20"/>
+                <w:sz w:val="21"/>
+                <w:szCs w:val="21"/>
               </w:rPr>
               <w:t xml:space="preserve">Bild</w:t>
             </w:r>
@@ -409,7 +454,7 @@
         <w:tc>
           <w:tcPr>
             <w:tcW w:type="dxa" w:w="4360"/>
-            <w:shd w:fill="2E4A52" w:color="auto" w:val="clear"/>
+            <w:shd w:fill="2C7A6B" w:color="auto" w:val="clear"/>
             <w:tcMar>
               <w:top w:type="dxa" w:w="80"/>
               <w:left w:type="dxa" w:w="120"/>
@@ -427,8 +472,8 @@
                 <w:b/>
                 <w:bCs/>
                 <w:color w:val="FFFFFF"/>
-                <w:sz w:val="20"/>
-                <w:szCs w:val="20"/>
+                <w:sz w:val="21"/>
+                <w:szCs w:val="21"/>
               </w:rPr>
               <w:t xml:space="preserve">Kern in einem Satz</w:t>
             </w:r>
@@ -456,9 +501,9 @@
                 <w:rFonts w:ascii="Calibri" w:cs="Calibri" w:eastAsia="Calibri" w:hAnsi="Calibri"/>
                 <w:b/>
                 <w:bCs/>
-                <w:color w:val="233139"/>
-                <w:sz w:val="20"/>
-                <w:szCs w:val="20"/>
+                <w:color w:val="23423C"/>
+                <w:sz w:val="22"/>
+                <w:szCs w:val="22"/>
               </w:rPr>
               <w:t xml:space="preserve">Depression</w:t>
             </w:r>
@@ -484,9 +529,9 @@
                 <w:rFonts w:ascii="Calibri" w:cs="Calibri" w:eastAsia="Calibri" w:hAnsi="Calibri"/>
                 <w:b w:val="false"/>
                 <w:bCs w:val="false"/>
-                <w:color w:val="233139"/>
-                <w:sz w:val="20"/>
-                <w:szCs w:val="20"/>
+                <w:color w:val="23423C"/>
+                <w:sz w:val="22"/>
+                <w:szCs w:val="22"/>
               </w:rPr>
               <w:t xml:space="preserve">Unsichtbarer Rucksack / Graufilter</w:t>
             </w:r>
@@ -512,9 +557,9 @@
                 <w:rFonts w:ascii="Calibri" w:cs="Calibri" w:eastAsia="Calibri" w:hAnsi="Calibri"/>
                 <w:b w:val="false"/>
                 <w:bCs w:val="false"/>
-                <w:color w:val="233139"/>
-                <w:sz w:val="20"/>
-                <w:szCs w:val="20"/>
+                <w:color w:val="23423C"/>
+                <w:sz w:val="22"/>
+                <w:szCs w:val="22"/>
               </w:rPr>
               <w:t xml:space="preserve">Nicht traurig, sondern leer und bleischwer – jede Kleinigkeit kostet Kraft.</w:t>
             </w:r>
@@ -525,7 +570,7 @@
         <w:tc>
           <w:tcPr>
             <w:tcW w:type="dxa" w:w="2000"/>
-            <w:shd w:fill="F1F5F3" w:color="auto" w:val="clear"/>
+            <w:shd w:fill="F1F8F4" w:color="auto" w:val="clear"/>
             <w:tcMar>
               <w:top w:type="dxa" w:w="70"/>
               <w:left w:type="dxa" w:w="120"/>
@@ -542,9 +587,9 @@
                 <w:rFonts w:ascii="Calibri" w:cs="Calibri" w:eastAsia="Calibri" w:hAnsi="Calibri"/>
                 <w:b/>
                 <w:bCs/>
-                <w:color w:val="233139"/>
-                <w:sz w:val="20"/>
-                <w:szCs w:val="20"/>
+                <w:color w:val="23423C"/>
+                <w:sz w:val="22"/>
+                <w:szCs w:val="22"/>
               </w:rPr>
               <w:t xml:space="preserve">Angst &amp; Panik</w:t>
             </w:r>
@@ -553,7 +598,7 @@
         <w:tc>
           <w:tcPr>
             <w:tcW w:type="dxa" w:w="3000"/>
-            <w:shd w:fill="F1F5F3" w:color="auto" w:val="clear"/>
+            <w:shd w:fill="F1F8F4" w:color="auto" w:val="clear"/>
             <w:tcMar>
               <w:top w:type="dxa" w:w="70"/>
               <w:left w:type="dxa" w:w="120"/>
@@ -570,9 +615,9 @@
                 <w:rFonts w:ascii="Calibri" w:cs="Calibri" w:eastAsia="Calibri" w:hAnsi="Calibri"/>
                 <w:b w:val="false"/>
                 <w:bCs w:val="false"/>
-                <w:color w:val="233139"/>
-                <w:sz w:val="20"/>
-                <w:szCs w:val="20"/>
+                <w:color w:val="23423C"/>
+                <w:sz w:val="22"/>
+                <w:szCs w:val="22"/>
               </w:rPr>
               <w:t xml:space="preserve">Rauchmelder ohne Feuer</w:t>
             </w:r>
@@ -581,7 +626,7 @@
         <w:tc>
           <w:tcPr>
             <w:tcW w:type="dxa" w:w="4360"/>
-            <w:shd w:fill="F1F5F3" w:color="auto" w:val="clear"/>
+            <w:shd w:fill="F1F8F4" w:color="auto" w:val="clear"/>
             <w:tcMar>
               <w:top w:type="dxa" w:w="70"/>
               <w:left w:type="dxa" w:w="120"/>
@@ -598,9 +643,9 @@
                 <w:rFonts w:ascii="Calibri" w:cs="Calibri" w:eastAsia="Calibri" w:hAnsi="Calibri"/>
                 <w:b w:val="false"/>
                 <w:bCs w:val="false"/>
-                <w:color w:val="233139"/>
-                <w:sz w:val="20"/>
-                <w:szCs w:val="20"/>
+                <w:color w:val="23423C"/>
+                <w:sz w:val="22"/>
+                <w:szCs w:val="22"/>
               </w:rPr>
               <w:t xml:space="preserve">Der Alarm ist echt, die Gefahr nicht – man kann sie sich nicht ausreden.</w:t>
             </w:r>
@@ -628,9 +673,9 @@
                 <w:rFonts w:ascii="Calibri" w:cs="Calibri" w:eastAsia="Calibri" w:hAnsi="Calibri"/>
                 <w:b/>
                 <w:bCs/>
-                <w:color w:val="233139"/>
-                <w:sz w:val="20"/>
-                <w:szCs w:val="20"/>
+                <w:color w:val="23423C"/>
+                <w:sz w:val="22"/>
+                <w:szCs w:val="22"/>
               </w:rPr>
               <w:t xml:space="preserve">Burnout</w:t>
             </w:r>
@@ -656,9 +701,9 @@
                 <w:rFonts w:ascii="Calibri" w:cs="Calibri" w:eastAsia="Calibri" w:hAnsi="Calibri"/>
                 <w:b w:val="false"/>
                 <w:bCs w:val="false"/>
-                <w:color w:val="233139"/>
-                <w:sz w:val="20"/>
-                <w:szCs w:val="20"/>
+                <w:color w:val="23423C"/>
+                <w:sz w:val="22"/>
+                <w:szCs w:val="22"/>
               </w:rPr>
               <w:t xml:space="preserve">Erloschenes Feuer</w:t>
             </w:r>
@@ -684,9 +729,9 @@
                 <w:rFonts w:ascii="Calibri" w:cs="Calibri" w:eastAsia="Calibri" w:hAnsi="Calibri"/>
                 <w:b w:val="false"/>
                 <w:bCs w:val="false"/>
-                <w:color w:val="233139"/>
-                <w:sz w:val="20"/>
-                <w:szCs w:val="20"/>
+                <w:color w:val="23423C"/>
+                <w:sz w:val="22"/>
+                <w:szCs w:val="22"/>
               </w:rPr>
               <w:t xml:space="preserve">Ausgebrannt nach zu langem Geben – trifft die Engagierten, nicht die Faulen.</w:t>
             </w:r>
@@ -697,7 +742,7 @@
         <w:tc>
           <w:tcPr>
             <w:tcW w:type="dxa" w:w="2000"/>
-            <w:shd w:fill="F1F5F3" w:color="auto" w:val="clear"/>
+            <w:shd w:fill="F1F8F4" w:color="auto" w:val="clear"/>
             <w:tcMar>
               <w:top w:type="dxa" w:w="70"/>
               <w:left w:type="dxa" w:w="120"/>
@@ -714,9 +759,9 @@
                 <w:rFonts w:ascii="Calibri" w:cs="Calibri" w:eastAsia="Calibri" w:hAnsi="Calibri"/>
                 <w:b/>
                 <w:bCs/>
-                <w:color w:val="233139"/>
-                <w:sz w:val="20"/>
-                <w:szCs w:val="20"/>
+                <w:color w:val="23423C"/>
+                <w:sz w:val="22"/>
+                <w:szCs w:val="22"/>
               </w:rPr>
               <w:t xml:space="preserve">PTBS</w:t>
             </w:r>
@@ -725,7 +770,7 @@
         <w:tc>
           <w:tcPr>
             <w:tcW w:type="dxa" w:w="3000"/>
-            <w:shd w:fill="F1F5F3" w:color="auto" w:val="clear"/>
+            <w:shd w:fill="F1F8F4" w:color="auto" w:val="clear"/>
             <w:tcMar>
               <w:top w:type="dxa" w:w="70"/>
               <w:left w:type="dxa" w:w="120"/>
@@ -742,9 +787,9 @@
                 <w:rFonts w:ascii="Calibri" w:cs="Calibri" w:eastAsia="Calibri" w:hAnsi="Calibri"/>
                 <w:b w:val="false"/>
                 <w:bCs w:val="false"/>
-                <w:color w:val="233139"/>
-                <w:sz w:val="20"/>
-                <w:szCs w:val="20"/>
+                <w:color w:val="23423C"/>
+                <w:sz w:val="22"/>
+                <w:szCs w:val="22"/>
               </w:rPr>
               <w:t xml:space="preserve">Alarmanlage in der Zeit</w:t>
             </w:r>
@@ -753,7 +798,7 @@
         <w:tc>
           <w:tcPr>
             <w:tcW w:type="dxa" w:w="4360"/>
-            <w:shd w:fill="F1F5F3" w:color="auto" w:val="clear"/>
+            <w:shd w:fill="F1F8F4" w:color="auto" w:val="clear"/>
             <w:tcMar>
               <w:top w:type="dxa" w:w="70"/>
               <w:left w:type="dxa" w:w="120"/>
@@ -770,9 +815,9 @@
                 <w:rFonts w:ascii="Calibri" w:cs="Calibri" w:eastAsia="Calibri" w:hAnsi="Calibri"/>
                 <w:b w:val="false"/>
                 <w:bCs w:val="false"/>
-                <w:color w:val="233139"/>
-                <w:sz w:val="20"/>
-                <w:szCs w:val="20"/>
+                <w:color w:val="23423C"/>
+                <w:sz w:val="22"/>
+                <w:szCs w:val="22"/>
               </w:rPr>
               <w:t xml:space="preserve">Ein Trigger – und der Körper verwechselt Vergangenheit mit Gegenwart.</w:t>
             </w:r>
@@ -800,9 +845,9 @@
                 <w:rFonts w:ascii="Calibri" w:cs="Calibri" w:eastAsia="Calibri" w:hAnsi="Calibri"/>
                 <w:b/>
                 <w:bCs/>
-                <w:color w:val="233139"/>
-                <w:sz w:val="20"/>
-                <w:szCs w:val="20"/>
+                <w:color w:val="23423C"/>
+                <w:sz w:val="22"/>
+                <w:szCs w:val="22"/>
               </w:rPr>
               <w:t xml:space="preserve">Bipolare Störung</w:t>
             </w:r>
@@ -828,9 +873,9 @@
                 <w:rFonts w:ascii="Calibri" w:cs="Calibri" w:eastAsia="Calibri" w:hAnsi="Calibri"/>
                 <w:b w:val="false"/>
                 <w:bCs w:val="false"/>
-                <w:color w:val="233139"/>
-                <w:sz w:val="20"/>
-                <w:szCs w:val="20"/>
+                <w:color w:val="23423C"/>
+                <w:sz w:val="22"/>
+                <w:szCs w:val="22"/>
               </w:rPr>
               <w:t xml:space="preserve">Gezeiten</w:t>
             </w:r>
@@ -856,9 +901,9 @@
                 <w:rFonts w:ascii="Calibri" w:cs="Calibri" w:eastAsia="Calibri" w:hAnsi="Calibri"/>
                 <w:b w:val="false"/>
                 <w:bCs w:val="false"/>
-                <w:color w:val="233139"/>
-                <w:sz w:val="20"/>
-                <w:szCs w:val="20"/>
+                <w:color w:val="23423C"/>
+                <w:sz w:val="22"/>
+                <w:szCs w:val="22"/>
               </w:rPr>
               <w:t xml:space="preserve">Echte Phasen zwischen Hoch und Tief – gut behandelbar.</w:t>
             </w:r>
@@ -888,18 +933,18 @@
           <w:rFonts w:ascii="Calibri" w:cs="Calibri" w:eastAsia="Calibri" w:hAnsi="Calibri"/>
           <w:b/>
           <w:bCs/>
-          <w:color w:val="233139"/>
-          <w:sz w:val="21"/>
-          <w:szCs w:val="21"/>
+          <w:color w:val="23423C"/>
+          <w:sz w:val="23"/>
+          <w:szCs w:val="23"/>
         </w:rPr>
         <w:t xml:space="preserve">Unsichtbar heißt nicht unecht. </w:t>
       </w:r>
       <w:r>
         <w:rPr>
           <w:rFonts w:ascii="Calibri" w:cs="Calibri" w:eastAsia="Calibri" w:hAnsi="Calibri"/>
-          <w:color w:val="233139"/>
-          <w:sz w:val="21"/>
-          <w:szCs w:val="21"/>
+          <w:color w:val="23423C"/>
+          <w:sz w:val="23"/>
+          <w:szCs w:val="23"/>
         </w:rPr>
         <w:t xml:space="preserve">Nur weil man es nicht sieht, ist es nicht weniger schwer.</w:t>
       </w:r>
@@ -918,18 +963,18 @@
           <w:rFonts w:ascii="Calibri" w:cs="Calibri" w:eastAsia="Calibri" w:hAnsi="Calibri"/>
           <w:b/>
           <w:bCs/>
-          <w:color w:val="233139"/>
-          <w:sz w:val="21"/>
-          <w:szCs w:val="21"/>
+          <w:color w:val="23423C"/>
+          <w:sz w:val="23"/>
+          <w:szCs w:val="23"/>
         </w:rPr>
         <w:t xml:space="preserve">Es ist Krankheit, nicht Wille. </w:t>
       </w:r>
       <w:r>
         <w:rPr>
           <w:rFonts w:ascii="Calibri" w:cs="Calibri" w:eastAsia="Calibri" w:hAnsi="Calibri"/>
-          <w:color w:val="233139"/>
-          <w:sz w:val="21"/>
-          <w:szCs w:val="21"/>
+          <w:color w:val="23423C"/>
+          <w:sz w:val="23"/>
+          <w:szCs w:val="23"/>
         </w:rPr>
         <w:t xml:space="preserve">„Zusammenreißen“ ist keine Behandlung – so wenig wie bei einem Beinbruch.</w:t>
       </w:r>
@@ -948,18 +993,18 @@
           <w:rFonts w:ascii="Calibri" w:cs="Calibri" w:eastAsia="Calibri" w:hAnsi="Calibri"/>
           <w:b/>
           <w:bCs/>
-          <w:color w:val="233139"/>
-          <w:sz w:val="21"/>
-          <w:szCs w:val="21"/>
+          <w:color w:val="23423C"/>
+          <w:sz w:val="23"/>
+          <w:szCs w:val="23"/>
         </w:rPr>
         <w:t xml:space="preserve">Da sein schlägt Ratschlag. </w:t>
       </w:r>
       <w:r>
         <w:rPr>
           <w:rFonts w:ascii="Calibri" w:cs="Calibri" w:eastAsia="Calibri" w:hAnsi="Calibri"/>
-          <w:color w:val="233139"/>
-          <w:sz w:val="21"/>
-          <w:szCs w:val="21"/>
+          <w:color w:val="23423C"/>
+          <w:sz w:val="23"/>
+          <w:szCs w:val="23"/>
         </w:rPr>
         <w:t xml:space="preserve">Zuhören, ernst nehmen, bleiben – das kann jede:r.</w:t>
       </w:r>
@@ -978,18 +1023,18 @@
           <w:rFonts w:ascii="Calibri" w:cs="Calibri" w:eastAsia="Calibri" w:hAnsi="Calibri"/>
           <w:b/>
           <w:bCs/>
-          <w:color w:val="233139"/>
-          <w:sz w:val="21"/>
-          <w:szCs w:val="21"/>
+          <w:color w:val="23423C"/>
+          <w:sz w:val="23"/>
+          <w:szCs w:val="23"/>
         </w:rPr>
         <w:t xml:space="preserve">Besserung ist möglich. </w:t>
       </w:r>
       <w:r>
         <w:rPr>
           <w:rFonts w:ascii="Calibri" w:cs="Calibri" w:eastAsia="Calibri" w:hAnsi="Calibri"/>
-          <w:color w:val="233139"/>
-          <w:sz w:val="21"/>
-          <w:szCs w:val="21"/>
+          <w:color w:val="23423C"/>
+          <w:sz w:val="23"/>
+          <w:szCs w:val="23"/>
         </w:rPr>
         <w:t xml:space="preserve">Mit Hilfe führt aus fast jeder Krise ein Weg heraus.</w:t>
       </w:r>
@@ -1006,12 +1051,12 @@
       <w:tblPr>
         <w:tblW w:type="dxa" w:w="9360"/>
         <w:tblBorders>
-          <w:top w:val="single" w:color="DCE6E3" w:sz="2"/>
-          <w:left w:val="single" w:color="DCE6E3" w:sz="2"/>
-          <w:bottom w:val="single" w:color="DCE6E3" w:sz="2"/>
-          <w:right w:val="single" w:color="DCE6E3" w:sz="2"/>
-          <w:insideH w:val="single" w:color="DCE6E3" w:sz="2"/>
-          <w:insideV w:val="single" w:color="DCE6E3" w:sz="2"/>
+          <w:top w:val="single" w:color="D9E9E1" w:sz="2"/>
+          <w:left w:val="single" w:color="D9E9E1" w:sz="2"/>
+          <w:bottom w:val="single" w:color="D9E9E1" w:sz="2"/>
+          <w:right w:val="single" w:color="D9E9E1" w:sz="2"/>
+          <w:insideH w:val="single" w:color="D9E9E1" w:sz="2"/>
+          <w:insideV w:val="single" w:color="D9E9E1" w:sz="2"/>
         </w:tblBorders>
       </w:tblPr>
       <w:tblGrid>
@@ -1025,7 +1070,7 @@
         <w:tc>
           <w:tcPr>
             <w:tcW w:type="dxa" w:w="4680"/>
-            <w:shd w:fill="2E4A52" w:color="auto" w:val="clear"/>
+            <w:shd w:fill="2C7A6B" w:color="auto" w:val="clear"/>
             <w:tcMar>
               <w:top w:type="dxa" w:w="80"/>
               <w:left w:type="dxa" w:w="120"/>
@@ -1043,8 +1088,8 @@
                 <w:b/>
                 <w:bCs/>
                 <w:color w:val="FFFFFF"/>
-                <w:sz w:val="20"/>
-                <w:szCs w:val="20"/>
+                <w:sz w:val="21"/>
+                <w:szCs w:val="21"/>
               </w:rPr>
               <w:t xml:space="preserve">Statt …</w:t>
             </w:r>
@@ -1053,7 +1098,7 @@
         <w:tc>
           <w:tcPr>
             <w:tcW w:type="dxa" w:w="4680"/>
-            <w:shd w:fill="2E4A52" w:color="auto" w:val="clear"/>
+            <w:shd w:fill="2C7A6B" w:color="auto" w:val="clear"/>
             <w:tcMar>
               <w:top w:type="dxa" w:w="80"/>
               <w:left w:type="dxa" w:w="120"/>
@@ -1071,8 +1116,8 @@
                 <w:b/>
                 <w:bCs/>
                 <w:color w:val="FFFFFF"/>
-                <w:sz w:val="20"/>
-                <w:szCs w:val="20"/>
+                <w:sz w:val="21"/>
+                <w:szCs w:val="21"/>
               </w:rPr>
               <w:t xml:space="preserve">Sag lieber …</w:t>
             </w:r>
@@ -1098,9 +1143,9 @@
             <w:r>
               <w:rPr>
                 <w:rFonts w:ascii="Calibri" w:cs="Calibri" w:eastAsia="Calibri" w:hAnsi="Calibri"/>
-                <w:color w:val="233139"/>
-                <w:sz w:val="20"/>
-                <w:szCs w:val="20"/>
+                <w:color w:val="23423C"/>
+                <w:sz w:val="22"/>
+                <w:szCs w:val="22"/>
               </w:rPr>
               <w:t xml:space="preserve">„Das wird schon wieder.“</w:t>
             </w:r>
@@ -1126,9 +1171,9 @@
                 <w:rFonts w:ascii="Calibri" w:cs="Calibri" w:eastAsia="Calibri" w:hAnsi="Calibri"/>
                 <w:b w:val="false"/>
                 <w:bCs w:val="false"/>
-                <w:color w:val="233139"/>
-                <w:sz w:val="20"/>
-                <w:szCs w:val="20"/>
+                <w:color w:val="23423C"/>
+                <w:sz w:val="22"/>
+                <w:szCs w:val="22"/>
               </w:rPr>
               <w:t xml:space="preserve">„Ich bin da – auch wenn’s dauert.“</w:t>
             </w:r>
@@ -1139,24 +1184,24 @@
         <w:tc>
           <w:tcPr>
             <w:tcW w:type="dxa" w:w="4680"/>
-            <w:shd w:fill="F1F5F3" w:color="auto" w:val="clear"/>
-            <w:tcMar>
-              <w:top w:type="dxa" w:w="70"/>
-              <w:left w:type="dxa" w:w="120"/>
-              <w:bottom w:type="dxa" w:w="70"/>
-              <w:right w:type="dxa" w:w="120"/>
-            </w:tcMar>
-          </w:tcPr>
-          <w:p>
-            <w:pPr>
-              <w:spacing w:after="0" w:line="250"/>
-            </w:pPr>
-            <w:r>
-              <w:rPr>
-                <w:rFonts w:ascii="Calibri" w:cs="Calibri" w:eastAsia="Calibri" w:hAnsi="Calibri"/>
-                <w:color w:val="233139"/>
-                <w:sz w:val="20"/>
-                <w:szCs w:val="20"/>
+            <w:shd w:fill="F1F8F4" w:color="auto" w:val="clear"/>
+            <w:tcMar>
+              <w:top w:type="dxa" w:w="70"/>
+              <w:left w:type="dxa" w:w="120"/>
+              <w:bottom w:type="dxa" w:w="70"/>
+              <w:right w:type="dxa" w:w="120"/>
+            </w:tcMar>
+          </w:tcPr>
+          <w:p>
+            <w:pPr>
+              <w:spacing w:after="0" w:line="250"/>
+            </w:pPr>
+            <w:r>
+              <w:rPr>
+                <w:rFonts w:ascii="Calibri" w:cs="Calibri" w:eastAsia="Calibri" w:hAnsi="Calibri"/>
+                <w:color w:val="23423C"/>
+                <w:sz w:val="22"/>
+                <w:szCs w:val="22"/>
               </w:rPr>
               <w:t xml:space="preserve">„Denk positiv!“</w:t>
             </w:r>
@@ -1165,7 +1210,7 @@
         <w:tc>
           <w:tcPr>
             <w:tcW w:type="dxa" w:w="4680"/>
-            <w:shd w:fill="F1F5F3" w:color="auto" w:val="clear"/>
+            <w:shd w:fill="F1F8F4" w:color="auto" w:val="clear"/>
             <w:tcMar>
               <w:top w:type="dxa" w:w="70"/>
               <w:left w:type="dxa" w:w="120"/>
@@ -1182,9 +1227,9 @@
                 <w:rFonts w:ascii="Calibri" w:cs="Calibri" w:eastAsia="Calibri" w:hAnsi="Calibri"/>
                 <w:b w:val="false"/>
                 <w:bCs w:val="false"/>
-                <w:color w:val="233139"/>
-                <w:sz w:val="20"/>
-                <w:szCs w:val="20"/>
+                <w:color w:val="23423C"/>
+                <w:sz w:val="22"/>
+                <w:szCs w:val="22"/>
               </w:rPr>
               <w:t xml:space="preserve">„Du musst das nicht allein tragen.“</w:t>
             </w:r>
@@ -1210,9 +1255,9 @@
             <w:r>
               <w:rPr>
                 <w:rFonts w:ascii="Calibri" w:cs="Calibri" w:eastAsia="Calibri" w:hAnsi="Calibri"/>
-                <w:color w:val="233139"/>
-                <w:sz w:val="20"/>
-                <w:szCs w:val="20"/>
+                <w:color w:val="23423C"/>
+                <w:sz w:val="22"/>
+                <w:szCs w:val="22"/>
               </w:rPr>
               <w:t xml:space="preserve">„Was hast du denn?“</w:t>
             </w:r>
@@ -1238,9 +1283,9 @@
                 <w:rFonts w:ascii="Calibri" w:cs="Calibri" w:eastAsia="Calibri" w:hAnsi="Calibri"/>
                 <w:b w:val="false"/>
                 <w:bCs w:val="false"/>
-                <w:color w:val="233139"/>
-                <w:sz w:val="20"/>
-                <w:szCs w:val="20"/>
+                <w:color w:val="23423C"/>
+                <w:sz w:val="22"/>
+                <w:szCs w:val="22"/>
               </w:rPr>
               <w:t xml:space="preserve">„Magst du erzählen, wie es dir geht?“</w:t>
             </w:r>
@@ -1251,24 +1296,24 @@
         <w:tc>
           <w:tcPr>
             <w:tcW w:type="dxa" w:w="4680"/>
-            <w:shd w:fill="F1F5F3" w:color="auto" w:val="clear"/>
-            <w:tcMar>
-              <w:top w:type="dxa" w:w="70"/>
-              <w:left w:type="dxa" w:w="120"/>
-              <w:bottom w:type="dxa" w:w="70"/>
-              <w:right w:type="dxa" w:w="120"/>
-            </w:tcMar>
-          </w:tcPr>
-          <w:p>
-            <w:pPr>
-              <w:spacing w:after="0" w:line="250"/>
-            </w:pPr>
-            <w:r>
-              <w:rPr>
-                <w:rFonts w:ascii="Calibri" w:cs="Calibri" w:eastAsia="Calibri" w:hAnsi="Calibri"/>
-                <w:color w:val="233139"/>
-                <w:sz w:val="20"/>
-                <w:szCs w:val="20"/>
+            <w:shd w:fill="F1F8F4" w:color="auto" w:val="clear"/>
+            <w:tcMar>
+              <w:top w:type="dxa" w:w="70"/>
+              <w:left w:type="dxa" w:w="120"/>
+              <w:bottom w:type="dxa" w:w="70"/>
+              <w:right w:type="dxa" w:w="120"/>
+            </w:tcMar>
+          </w:tcPr>
+          <w:p>
+            <w:pPr>
+              <w:spacing w:after="0" w:line="250"/>
+            </w:pPr>
+            <w:r>
+              <w:rPr>
+                <w:rFonts w:ascii="Calibri" w:cs="Calibri" w:eastAsia="Calibri" w:hAnsi="Calibri"/>
+                <w:color w:val="23423C"/>
+                <w:sz w:val="22"/>
+                <w:szCs w:val="22"/>
               </w:rPr>
               <w:t xml:space="preserve">„Reiß dich zusammen.“</w:t>
             </w:r>
@@ -1277,7 +1322,7 @@
         <w:tc>
           <w:tcPr>
             <w:tcW w:type="dxa" w:w="4680"/>
-            <w:shd w:fill="F1F5F3" w:color="auto" w:val="clear"/>
+            <w:shd w:fill="F1F8F4" w:color="auto" w:val="clear"/>
             <w:tcMar>
               <w:top w:type="dxa" w:w="70"/>
               <w:left w:type="dxa" w:w="120"/>
@@ -1294,9 +1339,9 @@
                 <w:rFonts w:ascii="Calibri" w:cs="Calibri" w:eastAsia="Calibri" w:hAnsi="Calibri"/>
                 <w:b w:val="false"/>
                 <w:bCs w:val="false"/>
-                <w:color w:val="233139"/>
-                <w:sz w:val="20"/>
-                <w:szCs w:val="20"/>
+                <w:color w:val="23423C"/>
+                <w:sz w:val="22"/>
+                <w:szCs w:val="22"/>
               </w:rPr>
               <w:t xml:space="preserve">„Was würde dir gerade helfen?“</w:t>
             </w:r>
@@ -1308,10 +1353,10 @@
       <w:tblPr>
         <w:tblW w:type="dxa" w:w="9360"/>
         <w:tblBorders>
-          <w:top w:val="single" w:color="F6ECE0" w:sz="2"/>
-          <w:left w:val="single" w:color="B9793B" w:sz="18"/>
-          <w:bottom w:val="single" w:color="F6ECE0" w:sz="2"/>
-          <w:right w:val="single" w:color="F6ECE0" w:sz="2"/>
+          <w:top w:val="single" w:color="F8EEDD" w:sz="2"/>
+          <w:left w:val="single" w:color="BC722A" w:sz="18"/>
+          <w:bottom w:val="single" w:color="F8EEDD" w:sz="2"/>
+          <w:right w:val="single" w:color="F8EEDD" w:sz="2"/>
           <w:insideH w:val="none"/>
           <w:insideV w:val="none"/>
         </w:tblBorders>
@@ -1323,7 +1368,7 @@
         <w:tc>
           <w:tcPr>
             <w:tcW w:type="dxa" w:w="9360"/>
-            <w:shd w:fill="F6ECE0" w:color="auto" w:val="clear"/>
+            <w:shd w:fill="F8EEDD" w:color="auto" w:val="clear"/>
             <w:tcMar>
               <w:top w:type="dxa" w:w="140"/>
               <w:left w:type="dxa" w:w="200"/>
@@ -1340,9 +1385,9 @@
                 <w:rFonts w:ascii="Cambria" w:cs="Cambria" w:eastAsia="Cambria" w:hAnsi="Cambria"/>
                 <w:b/>
                 <w:bCs/>
-                <w:color w:val="B9793B"/>
-                <w:sz w:val="22"/>
-                <w:szCs w:val="22"/>
+                <w:color w:val="BC722A"/>
+                <w:sz w:val="24"/>
+                <w:szCs w:val="24"/>
               </w:rPr>
               <w:t xml:space="preserve">Im Notfall</w:t>
             </w:r>
@@ -1356,7 +1401,7 @@
                 <w:rFonts w:ascii="Calibri" w:cs="Calibri" w:eastAsia="Calibri" w:hAnsi="Calibri"/>
                 <w:b/>
                 <w:bCs/>
-                <w:color w:val="B9793B"/>
+                <w:color w:val="BC722A"/>
                 <w:sz w:val="22"/>
                 <w:szCs w:val="22"/>
               </w:rPr>
@@ -1365,9 +1410,9 @@
             <w:r>
               <w:rPr>
                 <w:rFonts w:ascii="Calibri" w:cs="Calibri" w:eastAsia="Calibri" w:hAnsi="Calibri"/>
-                <w:color w:val="233139"/>
-                <w:sz w:val="21"/>
-                <w:szCs w:val="21"/>
+                <w:color w:val="23423C"/>
+                <w:sz w:val="23"/>
+                <w:szCs w:val="23"/>
               </w:rPr>
               <w:t xml:space="preserve">(24 h, kostenlos, anonym)</w:t>
             </w:r>
@@ -1395,9 +1440,9 @@
       <w:r>
         <w:rPr>
           <w:rFonts w:ascii="Calibri" w:cs="Calibri" w:eastAsia="Calibri" w:hAnsi="Calibri"/>
-          <w:color w:val="233139"/>
-          <w:sz w:val="21"/>
-          <w:szCs w:val="21"/>
+          <w:color w:val="23423C"/>
+          <w:sz w:val="23"/>
+          <w:szCs w:val="23"/>
         </w:rPr>
         <w:t xml:space="preserve">Lesen Sie den Tagesablauf still. Grundregel: Jede Aufgabe kostet „+15 kg“ – wie ein unsichtbarer Rucksack voller Steine. Kein Schauspiel – nur mitlesen und spüren.</w:t>
       </w:r>
@@ -1406,10 +1451,10 @@
       <w:tblPr>
         <w:tblW w:type="dxa" w:w="9360"/>
         <w:tblBorders>
-          <w:top w:val="dashSmallGap" w:color="3F7C79" w:sz="6"/>
-          <w:left w:val="dashSmallGap" w:color="3F7C79" w:sz="6"/>
-          <w:bottom w:val="dashSmallGap" w:color="3F7C79" w:sz="6"/>
-          <w:right w:val="dashSmallGap" w:color="3F7C79" w:sz="6"/>
+          <w:top w:val="dashSmallGap" w:color="2E9284" w:sz="6"/>
+          <w:left w:val="dashSmallGap" w:color="2E9284" w:sz="6"/>
+          <w:bottom w:val="dashSmallGap" w:color="2E9284" w:sz="6"/>
+          <w:right w:val="dashSmallGap" w:color="2E9284" w:sz="6"/>
           <w:insideH w:val="none"/>
           <w:insideV w:val="none"/>
         </w:tblBorders>
@@ -1421,7 +1466,7 @@
         <w:tc>
           <w:tcPr>
             <w:tcW w:type="dxa" w:w="9360"/>
-            <w:shd w:fill="F1F5F3" w:color="auto" w:val="clear"/>
+            <w:shd w:fill="F1F8F4" w:color="auto" w:val="clear"/>
             <w:tcMar>
               <w:top w:type="dxa" w:w="160"/>
               <w:left w:type="dxa" w:w="220"/>
@@ -1438,7 +1483,7 @@
                 <w:rFonts w:ascii="Cambria" w:cs="Cambria" w:eastAsia="Cambria" w:hAnsi="Cambria"/>
                 <w:b/>
                 <w:bCs/>
-                <w:color w:val="2E4A52"/>
+                <w:color w:val="2C7A6B"/>
                 <w:sz w:val="24"/>
                 <w:szCs w:val="24"/>
               </w:rPr>
@@ -1452,9 +1497,9 @@
             <w:r>
               <w:rPr>
                 <w:rFonts w:ascii="Calibri" w:cs="Calibri" w:eastAsia="Calibri" w:hAnsi="Calibri"/>
-                <w:color w:val="233139"/>
-                <w:sz w:val="21"/>
-                <w:szCs w:val="21"/>
+                <w:color w:val="23423C"/>
+                <w:sz w:val="23"/>
+                <w:szCs w:val="23"/>
               </w:rPr>
               <w:t xml:space="preserve">06:30 — Der Wecker klingelt. Du bist wach, aber wie unter einer nassen Decke. Aufstehen fühlt sich an wie Gewichtheben. Du bleibst liegen. Der erste Gedanke: „Ich schaffe das heute nicht.“</w:t>
             </w:r>
@@ -1466,9 +1511,9 @@
             <w:r>
               <w:rPr>
                 <w:rFonts w:ascii="Calibri" w:cs="Calibri" w:eastAsia="Calibri" w:hAnsi="Calibri"/>
-                <w:color w:val="233139"/>
-                <w:sz w:val="21"/>
-                <w:szCs w:val="21"/>
+                <w:color w:val="23423C"/>
+                <w:sz w:val="23"/>
+                <w:szCs w:val="23"/>
               </w:rPr>
               <w:t xml:space="preserve">07:30 — Duschen, Anziehen, Zähneputzen – Handgriffe, die früher nebenbei liefen, wollen einzeln erkämpft werden. Frühstück? Kein Hunger, kein Geschmack.</w:t>
             </w:r>
@@ -1480,9 +1525,9 @@
             <w:r>
               <w:rPr>
                 <w:rFonts w:ascii="Calibri" w:cs="Calibri" w:eastAsia="Calibri" w:hAnsi="Calibri"/>
-                <w:color w:val="233139"/>
-                <w:sz w:val="21"/>
-                <w:szCs w:val="21"/>
+                <w:color w:val="23423C"/>
+                <w:sz w:val="23"/>
+                <w:szCs w:val="23"/>
               </w:rPr>
               <w:t xml:space="preserve">09:00 — Bei der Arbeit / unter Menschen setzt du dein Lächeln auf. Niemand soll etwas merken. Das kostet die meiste Kraft von allem. Innerlich zählst du die Stunden.</w:t>
             </w:r>
@@ -1494,9 +1539,9 @@
             <w:r>
               <w:rPr>
                 <w:rFonts w:ascii="Calibri" w:cs="Calibri" w:eastAsia="Calibri" w:hAnsi="Calibri"/>
-                <w:color w:val="233139"/>
-                <w:sz w:val="21"/>
-                <w:szCs w:val="21"/>
+                <w:color w:val="23423C"/>
+                <w:sz w:val="23"/>
+                <w:szCs w:val="23"/>
               </w:rPr>
               <w:t xml:space="preserve">13:00 — Eine Kollegin fragt, ob du mittagessen kommst. Du sagst ab. Nicht, weil du sie nicht magst – die Kraft für Menschen ist heute einfach aufgebraucht.</w:t>
             </w:r>
@@ -1508,9 +1553,9 @@
             <w:r>
               <w:rPr>
                 <w:rFonts w:ascii="Calibri" w:cs="Calibri" w:eastAsia="Calibri" w:hAnsi="Calibri"/>
-                <w:color w:val="233139"/>
-                <w:sz w:val="21"/>
-                <w:szCs w:val="21"/>
+                <w:color w:val="23423C"/>
+                <w:sz w:val="23"/>
+                <w:szCs w:val="23"/>
               </w:rPr>
               <w:t xml:space="preserve">17:00 — Der Weg nach Hause zieht sich. Die Einkäufe, die du erledigen wolltest – morgen. Vielleicht.</w:t>
             </w:r>
@@ -1522,9 +1567,9 @@
             <w:r>
               <w:rPr>
                 <w:rFonts w:ascii="Calibri" w:cs="Calibri" w:eastAsia="Calibri" w:hAnsi="Calibri"/>
-                <w:color w:val="233139"/>
-                <w:sz w:val="21"/>
-                <w:szCs w:val="21"/>
+                <w:color w:val="23423C"/>
+                <w:sz w:val="23"/>
+                <w:szCs w:val="23"/>
               </w:rPr>
               <w:t xml:space="preserve">20:00 — Auf dem Sofa. Der Film, den du liebst, lässt dich kalt. Freude fühlt sich an wie ein Wort in einer fremden Sprache. Die To-do-Liste schaut dich an.</w:t>
             </w:r>
@@ -1536,9 +1581,9 @@
             <w:r>
               <w:rPr>
                 <w:rFonts w:ascii="Calibri" w:cs="Calibri" w:eastAsia="Calibri" w:hAnsi="Calibri"/>
-                <w:color w:val="233139"/>
-                <w:sz w:val="21"/>
-                <w:szCs w:val="21"/>
+                <w:color w:val="23423C"/>
+                <w:sz w:val="23"/>
+                <w:szCs w:val="23"/>
               </w:rPr>
               <w:t xml:space="preserve">23:30 — Du bist erschöpft, aber der Schlaf kommt nicht. Die Gedanken drehen sich: „Warum kriege ich mein Leben nicht auf die Reihe? Alle anderen schaffen das doch.“</w:t>
             </w:r>
@@ -1566,9 +1611,9 @@
       <w:r>
         <w:rPr>
           <w:rFonts w:ascii="Calibri" w:cs="Calibri" w:eastAsia="Calibri" w:hAnsi="Calibri"/>
-          <w:color w:val="233139"/>
-          <w:sz w:val="21"/>
-          <w:szCs w:val="21"/>
+          <w:color w:val="23423C"/>
+          <w:sz w:val="23"/>
+          <w:szCs w:val="23"/>
         </w:rPr>
         <w:t xml:space="preserve">Was hätten Sie an diesem Tag so nicht geschafft?</w:t>
       </w:r>
@@ -1576,7 +1621,7 @@
     <w:p>
       <w:pPr>
         <w:pBdr>
-          <w:bottom w:val="single" w:color="5E6E73" w:sz="4" w:space="3"/>
+          <w:bottom w:val="single" w:color="5E736E" w:sz="4" w:space="3"/>
         </w:pBdr>
         <w:spacing w:after="200" w:before="60"/>
       </w:pPr>
@@ -1584,7 +1629,7 @@
     <w:p>
       <w:pPr>
         <w:pBdr>
-          <w:bottom w:val="single" w:color="5E6E73" w:sz="4" w:space="3"/>
+          <w:bottom w:val="single" w:color="5E736E" w:sz="4" w:space="3"/>
         </w:pBdr>
         <w:spacing w:after="200" w:before="60"/>
       </w:pPr>
@@ -1601,9 +1646,9 @@
       <w:r>
         <w:rPr>
           <w:rFonts w:ascii="Calibri" w:cs="Calibri" w:eastAsia="Calibri" w:hAnsi="Calibri"/>
-          <w:color w:val="233139"/>
-          <w:sz w:val="21"/>
-          <w:szCs w:val="21"/>
+          <w:color w:val="23423C"/>
+          <w:sz w:val="23"/>
+          <w:szCs w:val="23"/>
         </w:rPr>
         <w:t xml:space="preserve">An welcher Stelle hätten Sie sich Verständnis gewünscht – und von wem?</w:t>
       </w:r>
@@ -1611,7 +1656,7 @@
     <w:p>
       <w:pPr>
         <w:pBdr>
-          <w:bottom w:val="single" w:color="5E6E73" w:sz="4" w:space="3"/>
+          <w:bottom w:val="single" w:color="5E736E" w:sz="4" w:space="3"/>
         </w:pBdr>
         <w:spacing w:after="200" w:before="60"/>
       </w:pPr>
@@ -1619,7 +1664,7 @@
     <w:p>
       <w:pPr>
         <w:pBdr>
-          <w:bottom w:val="single" w:color="5E6E73" w:sz="4" w:space="3"/>
+          <w:bottom w:val="single" w:color="5E736E" w:sz="4" w:space="3"/>
         </w:pBdr>
         <w:spacing w:after="200" w:before="60"/>
       </w:pPr>
@@ -1636,9 +1681,9 @@
       <w:r>
         <w:rPr>
           <w:rFonts w:ascii="Calibri" w:cs="Calibri" w:eastAsia="Calibri" w:hAnsi="Calibri"/>
-          <w:color w:val="233139"/>
-          <w:sz w:val="21"/>
-          <w:szCs w:val="21"/>
+          <w:color w:val="23423C"/>
+          <w:sz w:val="23"/>
+          <w:szCs w:val="23"/>
         </w:rPr>
         <w:t xml:space="preserve">Was nehmen Sie für Ihren Blick auf „unzuverlässige“ Menschen mit?</w:t>
       </w:r>
@@ -1646,7 +1691,7 @@
     <w:p>
       <w:pPr>
         <w:pBdr>
-          <w:bottom w:val="single" w:color="5E6E73" w:sz="4" w:space="3"/>
+          <w:bottom w:val="single" w:color="5E736E" w:sz="4" w:space="3"/>
         </w:pBdr>
         <w:spacing w:after="200" w:before="60"/>
       </w:pPr>
@@ -1654,7 +1699,7 @@
     <w:p>
       <w:pPr>
         <w:pBdr>
-          <w:bottom w:val="single" w:color="5E6E73" w:sz="4" w:space="3"/>
+          <w:bottom w:val="single" w:color="5E736E" w:sz="4" w:space="3"/>
         </w:pBdr>
         <w:spacing w:after="200" w:before="60"/>
       </w:pPr>
@@ -1679,9 +1724,9 @@
       <w:r>
         <w:rPr>
           <w:rFonts w:ascii="Calibri" w:cs="Calibri" w:eastAsia="Calibri" w:hAnsi="Calibri"/>
-          <w:color w:val="233139"/>
-          <w:sz w:val="21"/>
-          <w:szCs w:val="21"/>
+          <w:color w:val="23423C"/>
+          <w:sz w:val="23"/>
+          <w:szCs w:val="23"/>
         </w:rPr>
         <w:t xml:space="preserve">Stimmen Sie bei jeder Aussage zuerst ab: Daumen hoch = Wahrheit, Daumen runter = Mythos. Danach gemeinsam auflösen.</w:t>
       </w:r>
@@ -1695,7 +1740,7 @@
           <w:rFonts w:ascii="Cambria" w:cs="Cambria" w:eastAsia="Cambria" w:hAnsi="Cambria"/>
           <w:b/>
           <w:bCs/>
-          <w:color w:val="2E4A52"/>
+          <w:color w:val="2C7A6B"/>
           <w:sz w:val="22"/>
           <w:szCs w:val="22"/>
         </w:rPr>
@@ -1706,7 +1751,7 @@
           <w:rFonts w:ascii="Calibri" w:cs="Calibri" w:eastAsia="Calibri" w:hAnsi="Calibri"/>
           <w:i/>
           <w:iCs/>
-          <w:color w:val="233139"/>
+          <w:color w:val="23423C"/>
           <w:sz w:val="22"/>
           <w:szCs w:val="22"/>
         </w:rPr>
@@ -1720,7 +1765,7 @@
       <w:r>
         <w:rPr>
           <w:rFonts w:ascii="Calibri" w:cs="Calibri" w:eastAsia="Calibri" w:hAnsi="Calibri"/>
-          <w:color w:val="5E6E73"/>
+          <w:color w:val="5E736E"/>
           <w:sz w:val="20"/>
           <w:szCs w:val="20"/>
         </w:rPr>
@@ -1731,10 +1776,10 @@
       <w:tblPr>
         <w:tblW w:type="dxa" w:w="9360"/>
         <w:tblBorders>
-          <w:top w:val="single" w:color="EAF1EF" w:sz="2"/>
-          <w:left w:val="single" w:color="B9793B" w:sz="18"/>
-          <w:bottom w:val="single" w:color="EAF1EF" w:sz="2"/>
-          <w:right w:val="single" w:color="EAF1EF" w:sz="2"/>
+          <w:top w:val="single" w:color="E6F2EC" w:sz="2"/>
+          <w:left w:val="single" w:color="BC722A" w:sz="18"/>
+          <w:bottom w:val="single" w:color="E6F2EC" w:sz="2"/>
+          <w:right w:val="single" w:color="E6F2EC" w:sz="2"/>
           <w:insideH w:val="none"/>
           <w:insideV w:val="none"/>
         </w:tblBorders>
@@ -1746,7 +1791,7 @@
         <w:tc>
           <w:tcPr>
             <w:tcW w:type="dxa" w:w="9360"/>
-            <w:shd w:fill="EAF1EF" w:color="auto" w:val="clear"/>
+            <w:shd w:fill="E6F2EC" w:color="auto" w:val="clear"/>
             <w:tcMar>
               <w:top w:type="dxa" w:w="140"/>
               <w:left w:type="dxa" w:w="200"/>
@@ -1763,9 +1808,9 @@
                 <w:rFonts w:ascii="Cambria" w:cs="Cambria" w:eastAsia="Cambria" w:hAnsi="Cambria"/>
                 <w:b/>
                 <w:bCs/>
-                <w:color w:val="B9793B"/>
-                <w:sz w:val="22"/>
-                <w:szCs w:val="22"/>
+                <w:color w:val="BC722A"/>
+                <w:sz w:val="24"/>
+                <w:szCs w:val="24"/>
               </w:rPr>
               <w:t xml:space="preserve">Auflösung: MYTHOS</w:t>
             </w:r>
@@ -1777,9 +1822,9 @@
             <w:r>
               <w:rPr>
                 <w:rFonts w:ascii="Calibri" w:cs="Calibri" w:eastAsia="Calibri" w:hAnsi="Calibri"/>
-                <w:color w:val="233139"/>
-                <w:sz w:val="21"/>
-                <w:szCs w:val="21"/>
+                <w:color w:val="23423C"/>
+                <w:sz w:val="23"/>
+                <w:szCs w:val="23"/>
               </w:rPr>
               <w:t xml:space="preserve">Depression lähmt den Antrieb. Betroffene kämpfen härter als jeder vermeintlich „Faule“ – gegen eine Krankheit, nicht gegen Unlust.</w:t>
             </w:r>
@@ -1796,7 +1841,7 @@
           <w:rFonts w:ascii="Cambria" w:cs="Cambria" w:eastAsia="Cambria" w:hAnsi="Cambria"/>
           <w:b/>
           <w:bCs/>
-          <w:color w:val="2E4A52"/>
+          <w:color w:val="2C7A6B"/>
           <w:sz w:val="22"/>
           <w:szCs w:val="22"/>
         </w:rPr>
@@ -1807,7 +1852,7 @@
           <w:rFonts w:ascii="Calibri" w:cs="Calibri" w:eastAsia="Calibri" w:hAnsi="Calibri"/>
           <w:i/>
           <w:iCs/>
-          <w:color w:val="233139"/>
+          <w:color w:val="23423C"/>
           <w:sz w:val="22"/>
           <w:szCs w:val="22"/>
         </w:rPr>
@@ -1821,7 +1866,7 @@
       <w:r>
         <w:rPr>
           <w:rFonts w:ascii="Calibri" w:cs="Calibri" w:eastAsia="Calibri" w:hAnsi="Calibri"/>
-          <w:color w:val="5E6E73"/>
+          <w:color w:val="5E736E"/>
           <w:sz w:val="20"/>
           <w:szCs w:val="20"/>
         </w:rPr>
@@ -1832,10 +1877,10 @@
       <w:tblPr>
         <w:tblW w:type="dxa" w:w="9360"/>
         <w:tblBorders>
-          <w:top w:val="single" w:color="EAF1EF" w:sz="2"/>
-          <w:left w:val="single" w:color="B9793B" w:sz="18"/>
-          <w:bottom w:val="single" w:color="EAF1EF" w:sz="2"/>
-          <w:right w:val="single" w:color="EAF1EF" w:sz="2"/>
+          <w:top w:val="single" w:color="E6F2EC" w:sz="2"/>
+          <w:left w:val="single" w:color="BC722A" w:sz="18"/>
+          <w:bottom w:val="single" w:color="E6F2EC" w:sz="2"/>
+          <w:right w:val="single" w:color="E6F2EC" w:sz="2"/>
           <w:insideH w:val="none"/>
           <w:insideV w:val="none"/>
         </w:tblBorders>
@@ -1847,7 +1892,7 @@
         <w:tc>
           <w:tcPr>
             <w:tcW w:type="dxa" w:w="9360"/>
-            <w:shd w:fill="EAF1EF" w:color="auto" w:val="clear"/>
+            <w:shd w:fill="E6F2EC" w:color="auto" w:val="clear"/>
             <w:tcMar>
               <w:top w:type="dxa" w:w="140"/>
               <w:left w:type="dxa" w:w="200"/>
@@ -1864,9 +1909,9 @@
                 <w:rFonts w:ascii="Cambria" w:cs="Cambria" w:eastAsia="Cambria" w:hAnsi="Cambria"/>
                 <w:b/>
                 <w:bCs/>
-                <w:color w:val="B9793B"/>
-                <w:sz w:val="22"/>
-                <w:szCs w:val="22"/>
+                <w:color w:val="BC722A"/>
+                <w:sz w:val="24"/>
+                <w:szCs w:val="24"/>
               </w:rPr>
               <w:t xml:space="preserve">Auflösung: MYTHOS</w:t>
             </w:r>
@@ -1878,9 +1923,9 @@
             <w:r>
               <w:rPr>
                 <w:rFonts w:ascii="Calibri" w:cs="Calibri" w:eastAsia="Calibri" w:hAnsi="Calibri"/>
-                <w:color w:val="233139"/>
-                <w:sz w:val="21"/>
-                <w:szCs w:val="21"/>
+                <w:color w:val="23423C"/>
+                <w:sz w:val="23"/>
+                <w:szCs w:val="23"/>
               </w:rPr>
               <w:t xml:space="preserve">Willenskraft heilt keine Erkrankung – so wenig wie bei einem gebrochenen Bein. Der Appell erzeugt nur Druck und Scham.</w:t>
             </w:r>
@@ -1897,7 +1942,7 @@
           <w:rFonts w:ascii="Cambria" w:cs="Cambria" w:eastAsia="Cambria" w:hAnsi="Cambria"/>
           <w:b/>
           <w:bCs/>
-          <w:color w:val="2E4A52"/>
+          <w:color w:val="2C7A6B"/>
           <w:sz w:val="22"/>
           <w:szCs w:val="22"/>
         </w:rPr>
@@ -1908,7 +1953,7 @@
           <w:rFonts w:ascii="Calibri" w:cs="Calibri" w:eastAsia="Calibri" w:hAnsi="Calibri"/>
           <w:i/>
           <w:iCs/>
-          <w:color w:val="233139"/>
+          <w:color w:val="23423C"/>
           <w:sz w:val="22"/>
           <w:szCs w:val="22"/>
         </w:rPr>
@@ -1922,7 +1967,7 @@
       <w:r>
         <w:rPr>
           <w:rFonts w:ascii="Calibri" w:cs="Calibri" w:eastAsia="Calibri" w:hAnsi="Calibri"/>
-          <w:color w:val="5E6E73"/>
+          <w:color w:val="5E736E"/>
           <w:sz w:val="20"/>
           <w:szCs w:val="20"/>
         </w:rPr>
@@ -1933,10 +1978,10 @@
       <w:tblPr>
         <w:tblW w:type="dxa" w:w="9360"/>
         <w:tblBorders>
-          <w:top w:val="single" w:color="EAF1EF" w:sz="2"/>
-          <w:left w:val="single" w:color="B9793B" w:sz="18"/>
-          <w:bottom w:val="single" w:color="EAF1EF" w:sz="2"/>
-          <w:right w:val="single" w:color="EAF1EF" w:sz="2"/>
+          <w:top w:val="single" w:color="E6F2EC" w:sz="2"/>
+          <w:left w:val="single" w:color="BC722A" w:sz="18"/>
+          <w:bottom w:val="single" w:color="E6F2EC" w:sz="2"/>
+          <w:right w:val="single" w:color="E6F2EC" w:sz="2"/>
           <w:insideH w:val="none"/>
           <w:insideV w:val="none"/>
         </w:tblBorders>
@@ -1948,7 +1993,7 @@
         <w:tc>
           <w:tcPr>
             <w:tcW w:type="dxa" w:w="9360"/>
-            <w:shd w:fill="EAF1EF" w:color="auto" w:val="clear"/>
+            <w:shd w:fill="E6F2EC" w:color="auto" w:val="clear"/>
             <w:tcMar>
               <w:top w:type="dxa" w:w="140"/>
               <w:left w:type="dxa" w:w="200"/>
@@ -1965,9 +2010,9 @@
                 <w:rFonts w:ascii="Cambria" w:cs="Cambria" w:eastAsia="Cambria" w:hAnsi="Cambria"/>
                 <w:b/>
                 <w:bCs/>
-                <w:color w:val="B9793B"/>
-                <w:sz w:val="22"/>
-                <w:szCs w:val="22"/>
+                <w:color w:val="BC722A"/>
+                <w:sz w:val="24"/>
+                <w:szCs w:val="24"/>
               </w:rPr>
               <w:t xml:space="preserve">Auflösung: MYTHOS</w:t>
             </w:r>
@@ -1979,9 +2024,9 @@
             <w:r>
               <w:rPr>
                 <w:rFonts w:ascii="Calibri" w:cs="Calibri" w:eastAsia="Calibri" w:hAnsi="Calibri"/>
-                <w:color w:val="233139"/>
-                <w:sz w:val="21"/>
-                <w:szCs w:val="21"/>
+                <w:color w:val="23423C"/>
+                <w:sz w:val="23"/>
+                <w:szCs w:val="23"/>
               </w:rPr>
               <w:t xml:space="preserve">Das Gegenteil stimmt: Man sieht sie meist nicht. Viele funktionieren nach außen perfekt – das ist der Kern dieses Workshops.</w:t>
             </w:r>
@@ -1998,7 +2043,7 @@
           <w:rFonts w:ascii="Cambria" w:cs="Cambria" w:eastAsia="Cambria" w:hAnsi="Cambria"/>
           <w:b/>
           <w:bCs/>
-          <w:color w:val="2E4A52"/>
+          <w:color w:val="2C7A6B"/>
           <w:sz w:val="22"/>
           <w:szCs w:val="22"/>
         </w:rPr>
@@ -2009,7 +2054,7 @@
           <w:rFonts w:ascii="Calibri" w:cs="Calibri" w:eastAsia="Calibri" w:hAnsi="Calibri"/>
           <w:i/>
           <w:iCs/>
-          <w:color w:val="233139"/>
+          <w:color w:val="23423C"/>
           <w:sz w:val="22"/>
           <w:szCs w:val="22"/>
         </w:rPr>
@@ -2023,7 +2068,7 @@
       <w:r>
         <w:rPr>
           <w:rFonts w:ascii="Calibri" w:cs="Calibri" w:eastAsia="Calibri" w:hAnsi="Calibri"/>
-          <w:color w:val="5E6E73"/>
+          <w:color w:val="5E736E"/>
           <w:sz w:val="20"/>
           <w:szCs w:val="20"/>
         </w:rPr>
@@ -2034,10 +2079,10 @@
       <w:tblPr>
         <w:tblW w:type="dxa" w:w="9360"/>
         <w:tblBorders>
-          <w:top w:val="single" w:color="EAF1EF" w:sz="2"/>
-          <w:left w:val="single" w:color="B9793B" w:sz="18"/>
-          <w:bottom w:val="single" w:color="EAF1EF" w:sz="2"/>
-          <w:right w:val="single" w:color="EAF1EF" w:sz="2"/>
+          <w:top w:val="single" w:color="E6F2EC" w:sz="2"/>
+          <w:left w:val="single" w:color="BC722A" w:sz="18"/>
+          <w:bottom w:val="single" w:color="E6F2EC" w:sz="2"/>
+          <w:right w:val="single" w:color="E6F2EC" w:sz="2"/>
           <w:insideH w:val="none"/>
           <w:insideV w:val="none"/>
         </w:tblBorders>
@@ -2049,7 +2094,7 @@
         <w:tc>
           <w:tcPr>
             <w:tcW w:type="dxa" w:w="9360"/>
-            <w:shd w:fill="EAF1EF" w:color="auto" w:val="clear"/>
+            <w:shd w:fill="E6F2EC" w:color="auto" w:val="clear"/>
             <w:tcMar>
               <w:top w:type="dxa" w:w="140"/>
               <w:left w:type="dxa" w:w="200"/>
@@ -2066,9 +2111,9 @@
                 <w:rFonts w:ascii="Cambria" w:cs="Cambria" w:eastAsia="Cambria" w:hAnsi="Cambria"/>
                 <w:b/>
                 <w:bCs/>
-                <w:color w:val="B9793B"/>
-                <w:sz w:val="22"/>
-                <w:szCs w:val="22"/>
+                <w:color w:val="BC722A"/>
+                <w:sz w:val="24"/>
+                <w:szCs w:val="24"/>
               </w:rPr>
               <w:t xml:space="preserve">Auflösung: MYTHOS</w:t>
             </w:r>
@@ -2080,9 +2125,9 @@
             <w:r>
               <w:rPr>
                 <w:rFonts w:ascii="Calibri" w:cs="Calibri" w:eastAsia="Calibri" w:hAnsi="Calibri"/>
-                <w:color w:val="233139"/>
-                <w:sz w:val="21"/>
-                <w:szCs w:val="21"/>
+                <w:color w:val="23423C"/>
+                <w:sz w:val="23"/>
+                <w:szCs w:val="23"/>
               </w:rPr>
               <w:t xml:space="preserve">Hilfe zu holen ist ein Akt von Mut und Stärke. Der erste Schritt ist der schwerste – und der wichtigste.</w:t>
             </w:r>
@@ -2110,9 +2155,9 @@
       <w:r>
         <w:rPr>
           <w:rFonts w:ascii="Calibri" w:cs="Calibri" w:eastAsia="Calibri" w:hAnsi="Calibri"/>
-          <w:color w:val="233139"/>
-          <w:sz w:val="21"/>
-          <w:szCs w:val="21"/>
+          <w:color w:val="23423C"/>
+          <w:sz w:val="23"/>
+          <w:szCs w:val="23"/>
         </w:rPr>
         <w:t xml:space="preserve">Zum Ausschneiden. Dreiergruppen: A = betroffen · B = Gegenüber · C = Beobachter (nutzt A5). 5 Minuten spielen, auswerten, Rollen tauschen. Niemand muss echtes eigenes Leid nachspielen.</w:t>
       </w:r>
@@ -2121,10 +2166,10 @@
       <w:tblPr>
         <w:tblW w:type="dxa" w:w="9360"/>
         <w:tblBorders>
-          <w:top w:val="dashSmallGap" w:color="B9793B" w:sz="6"/>
-          <w:left w:val="dashSmallGap" w:color="B9793B" w:sz="6"/>
-          <w:bottom w:val="dashSmallGap" w:color="B9793B" w:sz="6"/>
-          <w:right w:val="dashSmallGap" w:color="B9793B" w:sz="6"/>
+          <w:top w:val="dashSmallGap" w:color="BC722A" w:sz="6"/>
+          <w:left w:val="dashSmallGap" w:color="BC722A" w:sz="6"/>
+          <w:bottom w:val="dashSmallGap" w:color="BC722A" w:sz="6"/>
+          <w:right w:val="dashSmallGap" w:color="BC722A" w:sz="6"/>
           <w:insideH w:val="none"/>
           <w:insideV w:val="none"/>
         </w:tblBorders>
@@ -2153,7 +2198,7 @@
                 <w:rFonts w:ascii="Cambria" w:cs="Cambria" w:eastAsia="Cambria" w:hAnsi="Cambria"/>
                 <w:b/>
                 <w:bCs/>
-                <w:color w:val="B9793B"/>
+                <w:color w:val="BC722A"/>
                 <w:sz w:val="22"/>
                 <w:szCs w:val="22"/>
               </w:rPr>
@@ -2164,7 +2209,7 @@
                 <w:rFonts w:ascii="Cambria" w:cs="Cambria" w:eastAsia="Cambria" w:hAnsi="Cambria"/>
                 <w:b/>
                 <w:bCs/>
-                <w:color w:val="2E4A52"/>
+                <w:color w:val="2C7A6B"/>
                 <w:sz w:val="22"/>
                 <w:szCs w:val="22"/>
               </w:rPr>
@@ -2178,9 +2223,9 @@
             <w:r>
               <w:rPr>
                 <w:rFonts w:ascii="Calibri" w:cs="Calibri" w:eastAsia="Calibri" w:hAnsi="Calibri"/>
-                <w:color w:val="233139"/>
-                <w:sz w:val="21"/>
-                <w:szCs w:val="21"/>
+                <w:color w:val="23423C"/>
+                <w:sz w:val="23"/>
+                <w:szCs w:val="23"/>
               </w:rPr>
               <w:t xml:space="preserve">Eine Kollegin wirkt seit Wochen müde, zieht sich zurück, lächelt aber tapfer. Heute sitzt sie allein in der Küche. B möchte behutsam ins Gespräch kommen.</w:t>
             </w:r>
@@ -2197,10 +2242,10 @@
       <w:tblPr>
         <w:tblW w:type="dxa" w:w="9360"/>
         <w:tblBorders>
-          <w:top w:val="dashSmallGap" w:color="B9793B" w:sz="6"/>
-          <w:left w:val="dashSmallGap" w:color="B9793B" w:sz="6"/>
-          <w:bottom w:val="dashSmallGap" w:color="B9793B" w:sz="6"/>
-          <w:right w:val="dashSmallGap" w:color="B9793B" w:sz="6"/>
+          <w:top w:val="dashSmallGap" w:color="BC722A" w:sz="6"/>
+          <w:left w:val="dashSmallGap" w:color="BC722A" w:sz="6"/>
+          <w:bottom w:val="dashSmallGap" w:color="BC722A" w:sz="6"/>
+          <w:right w:val="dashSmallGap" w:color="BC722A" w:sz="6"/>
           <w:insideH w:val="none"/>
           <w:insideV w:val="none"/>
         </w:tblBorders>
@@ -2229,7 +2274,7 @@
                 <w:rFonts w:ascii="Cambria" w:cs="Cambria" w:eastAsia="Cambria" w:hAnsi="Cambria"/>
                 <w:b/>
                 <w:bCs/>
-                <w:color w:val="B9793B"/>
+                <w:color w:val="BC722A"/>
                 <w:sz w:val="22"/>
                 <w:szCs w:val="22"/>
               </w:rPr>
@@ -2240,7 +2285,7 @@
                 <w:rFonts w:ascii="Cambria" w:cs="Cambria" w:eastAsia="Cambria" w:hAnsi="Cambria"/>
                 <w:b/>
                 <w:bCs/>
-                <w:color w:val="2E4A52"/>
+                <w:color w:val="2C7A6B"/>
                 <w:sz w:val="22"/>
                 <w:szCs w:val="22"/>
               </w:rPr>
@@ -2254,9 +2299,9 @@
             <w:r>
               <w:rPr>
                 <w:rFonts w:ascii="Calibri" w:cs="Calibri" w:eastAsia="Calibri" w:hAnsi="Calibri"/>
-                <w:color w:val="233139"/>
-                <w:sz w:val="21"/>
-                <w:szCs w:val="21"/>
+                <w:color w:val="23423C"/>
+                <w:sz w:val="23"/>
+                <w:szCs w:val="23"/>
               </w:rPr>
               <w:t xml:space="preserve">Ein guter Freund hat zum dritten Mal ein Treffen kurzfristig abgesagt. B ruft an – enttäuscht, aber besorgt. A traut sich kaum zu sagen, wie es wirklich steht.</w:t>
             </w:r>
@@ -2273,10 +2318,10 @@
       <w:tblPr>
         <w:tblW w:type="dxa" w:w="9360"/>
         <w:tblBorders>
-          <w:top w:val="dashSmallGap" w:color="B9793B" w:sz="6"/>
-          <w:left w:val="dashSmallGap" w:color="B9793B" w:sz="6"/>
-          <w:bottom w:val="dashSmallGap" w:color="B9793B" w:sz="6"/>
-          <w:right w:val="dashSmallGap" w:color="B9793B" w:sz="6"/>
+          <w:top w:val="dashSmallGap" w:color="BC722A" w:sz="6"/>
+          <w:left w:val="dashSmallGap" w:color="BC722A" w:sz="6"/>
+          <w:bottom w:val="dashSmallGap" w:color="BC722A" w:sz="6"/>
+          <w:right w:val="dashSmallGap" w:color="BC722A" w:sz="6"/>
           <w:insideH w:val="none"/>
           <w:insideV w:val="none"/>
         </w:tblBorders>
@@ -2305,7 +2350,7 @@
                 <w:rFonts w:ascii="Cambria" w:cs="Cambria" w:eastAsia="Cambria" w:hAnsi="Cambria"/>
                 <w:b/>
                 <w:bCs/>
-                <w:color w:val="B9793B"/>
+                <w:color w:val="BC722A"/>
                 <w:sz w:val="22"/>
                 <w:szCs w:val="22"/>
               </w:rPr>
@@ -2316,7 +2361,7 @@
                 <w:rFonts w:ascii="Cambria" w:cs="Cambria" w:eastAsia="Cambria" w:hAnsi="Cambria"/>
                 <w:b/>
                 <w:bCs/>
-                <w:color w:val="2E4A52"/>
+                <w:color w:val="2C7A6B"/>
                 <w:sz w:val="22"/>
                 <w:szCs w:val="22"/>
               </w:rPr>
@@ -2330,9 +2375,9 @@
             <w:r>
               <w:rPr>
                 <w:rFonts w:ascii="Calibri" w:cs="Calibri" w:eastAsia="Calibri" w:hAnsi="Calibri"/>
-                <w:color w:val="233139"/>
-                <w:sz w:val="21"/>
-                <w:szCs w:val="21"/>
+                <w:color w:val="23423C"/>
+                <w:sz w:val="23"/>
+                <w:szCs w:val="23"/>
               </w:rPr>
               <w:t xml:space="preserve">A hatte in der U-Bahn eine Panikattacke und meidet seither öffentliche Verkehrsmittel. B erfährt davon und will unterstützen, ohne zu bevormunden.</w:t>
             </w:r>
@@ -2349,10 +2394,10 @@
       <w:tblPr>
         <w:tblW w:type="dxa" w:w="9360"/>
         <w:tblBorders>
-          <w:top w:val="dashSmallGap" w:color="B9793B" w:sz="6"/>
-          <w:left w:val="dashSmallGap" w:color="B9793B" w:sz="6"/>
-          <w:bottom w:val="dashSmallGap" w:color="B9793B" w:sz="6"/>
-          <w:right w:val="dashSmallGap" w:color="B9793B" w:sz="6"/>
+          <w:top w:val="dashSmallGap" w:color="BC722A" w:sz="6"/>
+          <w:left w:val="dashSmallGap" w:color="BC722A" w:sz="6"/>
+          <w:bottom w:val="dashSmallGap" w:color="BC722A" w:sz="6"/>
+          <w:right w:val="dashSmallGap" w:color="BC722A" w:sz="6"/>
           <w:insideH w:val="none"/>
           <w:insideV w:val="none"/>
         </w:tblBorders>
@@ -2381,7 +2426,7 @@
                 <w:rFonts w:ascii="Cambria" w:cs="Cambria" w:eastAsia="Cambria" w:hAnsi="Cambria"/>
                 <w:b/>
                 <w:bCs/>
-                <w:color w:val="B9793B"/>
+                <w:color w:val="BC722A"/>
                 <w:sz w:val="22"/>
                 <w:szCs w:val="22"/>
               </w:rPr>
@@ -2392,7 +2437,7 @@
                 <w:rFonts w:ascii="Cambria" w:cs="Cambria" w:eastAsia="Cambria" w:hAnsi="Cambria"/>
                 <w:b/>
                 <w:bCs/>
-                <w:color w:val="2E4A52"/>
+                <w:color w:val="2C7A6B"/>
                 <w:sz w:val="22"/>
                 <w:szCs w:val="22"/>
               </w:rPr>
@@ -2406,9 +2451,9 @@
             <w:r>
               <w:rPr>
                 <w:rFonts w:ascii="Calibri" w:cs="Calibri" w:eastAsia="Calibri" w:hAnsi="Calibri"/>
-                <w:color w:val="233139"/>
-                <w:sz w:val="21"/>
-                <w:szCs w:val="21"/>
+                <w:color w:val="23423C"/>
+                <w:sz w:val="23"/>
+                <w:szCs w:val="23"/>
               </w:rPr>
               <w:t xml:space="preserve">A sagt auf jede Frage „alles bestens“, wirkt aber sichtlich belastet. B spürt die Diskrepanz und möchte echten Kontakt herstellen.</w:t>
             </w:r>
@@ -2425,10 +2470,10 @@
       <w:tblPr>
         <w:tblW w:type="dxa" w:w="9360"/>
         <w:tblBorders>
-          <w:top w:val="dashSmallGap" w:color="B9793B" w:sz="6"/>
-          <w:left w:val="dashSmallGap" w:color="B9793B" w:sz="6"/>
-          <w:bottom w:val="dashSmallGap" w:color="B9793B" w:sz="6"/>
-          <w:right w:val="dashSmallGap" w:color="B9793B" w:sz="6"/>
+          <w:top w:val="dashSmallGap" w:color="BC722A" w:sz="6"/>
+          <w:left w:val="dashSmallGap" w:color="BC722A" w:sz="6"/>
+          <w:bottom w:val="dashSmallGap" w:color="BC722A" w:sz="6"/>
+          <w:right w:val="dashSmallGap" w:color="BC722A" w:sz="6"/>
           <w:insideH w:val="none"/>
           <w:insideV w:val="none"/>
         </w:tblBorders>
@@ -2457,7 +2502,7 @@
                 <w:rFonts w:ascii="Cambria" w:cs="Cambria" w:eastAsia="Cambria" w:hAnsi="Cambria"/>
                 <w:b/>
                 <w:bCs/>
-                <w:color w:val="B9793B"/>
+                <w:color w:val="BC722A"/>
                 <w:sz w:val="22"/>
                 <w:szCs w:val="22"/>
               </w:rPr>
@@ -2468,7 +2513,7 @@
                 <w:rFonts w:ascii="Cambria" w:cs="Cambria" w:eastAsia="Cambria" w:hAnsi="Cambria"/>
                 <w:b/>
                 <w:bCs/>
-                <w:color w:val="2E4A52"/>
+                <w:color w:val="2C7A6B"/>
                 <w:sz w:val="22"/>
                 <w:szCs w:val="22"/>
               </w:rPr>
@@ -2482,9 +2527,9 @@
             <w:r>
               <w:rPr>
                 <w:rFonts w:ascii="Calibri" w:cs="Calibri" w:eastAsia="Calibri" w:hAnsi="Calibri"/>
-                <w:color w:val="233139"/>
-                <w:sz w:val="21"/>
-                <w:szCs w:val="21"/>
+                <w:color w:val="23423C"/>
+                <w:sz w:val="23"/>
+                <w:szCs w:val="23"/>
               </w:rPr>
               <w:t xml:space="preserve">A kommt nach einer depressiven Episode zurück an den Arbeitsplatz und ist unsicher. B (Kolleg:in) will willkommen heißen, ohne zu überfordern.</w:t>
             </w:r>
@@ -2501,10 +2546,10 @@
       <w:tblPr>
         <w:tblW w:type="dxa" w:w="9360"/>
         <w:tblBorders>
-          <w:top w:val="dashSmallGap" w:color="B9793B" w:sz="6"/>
-          <w:left w:val="dashSmallGap" w:color="B9793B" w:sz="6"/>
-          <w:bottom w:val="dashSmallGap" w:color="B9793B" w:sz="6"/>
-          <w:right w:val="dashSmallGap" w:color="B9793B" w:sz="6"/>
+          <w:top w:val="dashSmallGap" w:color="BC722A" w:sz="6"/>
+          <w:left w:val="dashSmallGap" w:color="BC722A" w:sz="6"/>
+          <w:bottom w:val="dashSmallGap" w:color="BC722A" w:sz="6"/>
+          <w:right w:val="dashSmallGap" w:color="BC722A" w:sz="6"/>
           <w:insideH w:val="none"/>
           <w:insideV w:val="none"/>
         </w:tblBorders>
@@ -2533,7 +2578,7 @@
                 <w:rFonts w:ascii="Cambria" w:cs="Cambria" w:eastAsia="Cambria" w:hAnsi="Cambria"/>
                 <w:b/>
                 <w:bCs/>
-                <w:color w:val="B9793B"/>
+                <w:color w:val="BC722A"/>
                 <w:sz w:val="22"/>
                 <w:szCs w:val="22"/>
               </w:rPr>
@@ -2544,7 +2589,7 @@
                 <w:rFonts w:ascii="Cambria" w:cs="Cambria" w:eastAsia="Cambria" w:hAnsi="Cambria"/>
                 <w:b/>
                 <w:bCs/>
-                <w:color w:val="2E4A52"/>
+                <w:color w:val="2C7A6B"/>
                 <w:sz w:val="22"/>
                 <w:szCs w:val="22"/>
               </w:rPr>
@@ -2558,9 +2603,9 @@
             <w:r>
               <w:rPr>
                 <w:rFonts w:ascii="Calibri" w:cs="Calibri" w:eastAsia="Calibri" w:hAnsi="Calibri"/>
-                <w:color w:val="233139"/>
-                <w:sz w:val="21"/>
-                <w:szCs w:val="21"/>
+                <w:color w:val="23423C"/>
+                <w:sz w:val="23"/>
+                <w:szCs w:val="23"/>
               </w:rPr>
               <w:t xml:space="preserve">A macht sich große Sorgen um den eigenen Partner und ist selbst am Limit. B hört zu und hilft A, auch die eigenen Grenzen zu sehen.</w:t>
             </w:r>
@@ -2593,9 +2638,9 @@
       <w:r>
         <w:rPr>
           <w:rFonts w:ascii="Calibri" w:cs="Calibri" w:eastAsia="Calibri" w:hAnsi="Calibri"/>
-          <w:color w:val="233139"/>
-          <w:sz w:val="21"/>
-          <w:szCs w:val="21"/>
+          <w:color w:val="23423C"/>
+          <w:sz w:val="23"/>
+          <w:szCs w:val="23"/>
         </w:rPr>
         <w:t xml:space="preserve">Für Rolle C. Beobachten Sie das Gespräch und kreuzen Sie an. Geben Sie in der Auswertung zuerst das Positive zurück.</w:t>
       </w:r>
@@ -2604,12 +2649,12 @@
       <w:tblPr>
         <w:tblW w:type="dxa" w:w="9360"/>
         <w:tblBorders>
-          <w:top w:val="single" w:color="DCE6E3" w:sz="2"/>
-          <w:left w:val="single" w:color="DCE6E3" w:sz="2"/>
-          <w:bottom w:val="single" w:color="DCE6E3" w:sz="2"/>
-          <w:right w:val="single" w:color="DCE6E3" w:sz="2"/>
-          <w:insideH w:val="single" w:color="DCE6E3" w:sz="2"/>
-          <w:insideV w:val="single" w:color="DCE6E3" w:sz="2"/>
+          <w:top w:val="single" w:color="D9E9E1" w:sz="2"/>
+          <w:left w:val="single" w:color="D9E9E1" w:sz="2"/>
+          <w:bottom w:val="single" w:color="D9E9E1" w:sz="2"/>
+          <w:right w:val="single" w:color="D9E9E1" w:sz="2"/>
+          <w:insideH w:val="single" w:color="D9E9E1" w:sz="2"/>
+          <w:insideV w:val="single" w:color="D9E9E1" w:sz="2"/>
         </w:tblBorders>
       </w:tblPr>
       <w:tblGrid>
@@ -2625,7 +2670,7 @@
         <w:tc>
           <w:tcPr>
             <w:tcW w:type="dxa" w:w="6360"/>
-            <w:shd w:fill="2E4A52" w:color="auto" w:val="clear"/>
+            <w:shd w:fill="2C7A6B" w:color="auto" w:val="clear"/>
             <w:tcMar>
               <w:top w:type="dxa" w:w="80"/>
               <w:left w:type="dxa" w:w="120"/>
@@ -2643,8 +2688,8 @@
                 <w:b/>
                 <w:bCs/>
                 <w:color w:val="FFFFFF"/>
-                <w:sz w:val="20"/>
-                <w:szCs w:val="20"/>
+                <w:sz w:val="21"/>
+                <w:szCs w:val="21"/>
               </w:rPr>
               <w:t xml:space="preserve">Beobachtung</w:t>
             </w:r>
@@ -2653,7 +2698,7 @@
         <w:tc>
           <w:tcPr>
             <w:tcW w:type="dxa" w:w="1000"/>
-            <w:shd w:fill="2E4A52" w:color="auto" w:val="clear"/>
+            <w:shd w:fill="2C7A6B" w:color="auto" w:val="clear"/>
             <w:tcMar>
               <w:top w:type="dxa" w:w="80"/>
               <w:left w:type="dxa" w:w="120"/>
@@ -2671,8 +2716,8 @@
                 <w:b/>
                 <w:bCs/>
                 <w:color w:val="FFFFFF"/>
-                <w:sz w:val="20"/>
-                <w:szCs w:val="20"/>
+                <w:sz w:val="21"/>
+                <w:szCs w:val="21"/>
               </w:rPr>
               <w:t xml:space="preserve">Ja</w:t>
             </w:r>
@@ -2681,7 +2726,7 @@
         <w:tc>
           <w:tcPr>
             <w:tcW w:type="dxa" w:w="1000"/>
-            <w:shd w:fill="2E4A52" w:color="auto" w:val="clear"/>
+            <w:shd w:fill="2C7A6B" w:color="auto" w:val="clear"/>
             <w:tcMar>
               <w:top w:type="dxa" w:w="80"/>
               <w:left w:type="dxa" w:w="120"/>
@@ -2699,8 +2744,8 @@
                 <w:b/>
                 <w:bCs/>
                 <w:color w:val="FFFFFF"/>
-                <w:sz w:val="20"/>
-                <w:szCs w:val="20"/>
+                <w:sz w:val="21"/>
+                <w:szCs w:val="21"/>
               </w:rPr>
               <w:t xml:space="preserve">Teils</w:t>
             </w:r>
@@ -2709,7 +2754,7 @@
         <w:tc>
           <w:tcPr>
             <w:tcW w:type="dxa" w:w="1000"/>
-            <w:shd w:fill="2E4A52" w:color="auto" w:val="clear"/>
+            <w:shd w:fill="2C7A6B" w:color="auto" w:val="clear"/>
             <w:tcMar>
               <w:top w:type="dxa" w:w="80"/>
               <w:left w:type="dxa" w:w="120"/>
@@ -2727,8 +2772,8 @@
                 <w:b/>
                 <w:bCs/>
                 <w:color w:val="FFFFFF"/>
-                <w:sz w:val="20"/>
-                <w:szCs w:val="20"/>
+                <w:sz w:val="21"/>
+                <w:szCs w:val="21"/>
               </w:rPr>
               <w:t xml:space="preserve">Nein</w:t>
             </w:r>
@@ -2756,9 +2801,9 @@
                 <w:rFonts w:ascii="Calibri" w:cs="Calibri" w:eastAsia="Calibri" w:hAnsi="Calibri"/>
                 <w:b/>
                 <w:bCs/>
-                <w:color w:val="233139"/>
-                <w:sz w:val="20"/>
-                <w:szCs w:val="20"/>
+                <w:color w:val="23423C"/>
+                <w:sz w:val="22"/>
+                <w:szCs w:val="22"/>
               </w:rPr>
               <w:t xml:space="preserve">B hat sich zugewandt (Blickkontakt, Handy weg, Zeit)</w:t>
             </w:r>
@@ -2784,9 +2829,9 @@
                 <w:rFonts w:ascii="Calibri" w:cs="Calibri" w:eastAsia="Calibri" w:hAnsi="Calibri"/>
                 <w:b w:val="false"/>
                 <w:bCs w:val="false"/>
-                <w:color w:val="233139"/>
-                <w:sz w:val="20"/>
-                <w:szCs w:val="20"/>
+                <w:color w:val="23423C"/>
+                <w:sz w:val="22"/>
+                <w:szCs w:val="22"/>
               </w:rPr>
               <w:t xml:space="preserve">☐</w:t>
             </w:r>
@@ -2812,9 +2857,9 @@
                 <w:rFonts w:ascii="Calibri" w:cs="Calibri" w:eastAsia="Calibri" w:hAnsi="Calibri"/>
                 <w:b w:val="false"/>
                 <w:bCs w:val="false"/>
-                <w:color w:val="233139"/>
-                <w:sz w:val="20"/>
-                <w:szCs w:val="20"/>
+                <w:color w:val="23423C"/>
+                <w:sz w:val="22"/>
+                <w:szCs w:val="22"/>
               </w:rPr>
               <w:t xml:space="preserve">☐</w:t>
             </w:r>
@@ -2840,9 +2885,9 @@
                 <w:rFonts w:ascii="Calibri" w:cs="Calibri" w:eastAsia="Calibri" w:hAnsi="Calibri"/>
                 <w:b w:val="false"/>
                 <w:bCs w:val="false"/>
-                <w:color w:val="233139"/>
-                <w:sz w:val="20"/>
-                <w:szCs w:val="20"/>
+                <w:color w:val="23423C"/>
+                <w:sz w:val="22"/>
+                <w:szCs w:val="22"/>
               </w:rPr>
               <w:t xml:space="preserve">☐</w:t>
             </w:r>
@@ -2853,7 +2898,7 @@
         <w:tc>
           <w:tcPr>
             <w:tcW w:type="dxa" w:w="6360"/>
-            <w:shd w:fill="F1F5F3" w:color="auto" w:val="clear"/>
+            <w:shd w:fill="F1F8F4" w:color="auto" w:val="clear"/>
             <w:tcMar>
               <w:top w:type="dxa" w:w="70"/>
               <w:left w:type="dxa" w:w="120"/>
@@ -2870,9 +2915,9 @@
                 <w:rFonts w:ascii="Calibri" w:cs="Calibri" w:eastAsia="Calibri" w:hAnsi="Calibri"/>
                 <w:b/>
                 <w:bCs/>
-                <w:color w:val="233139"/>
-                <w:sz w:val="20"/>
-                <w:szCs w:val="20"/>
+                <w:color w:val="23423C"/>
+                <w:sz w:val="22"/>
+                <w:szCs w:val="22"/>
               </w:rPr>
               <w:t xml:space="preserve">B hat mehr zugehört als geredet</w:t>
             </w:r>
@@ -2881,7 +2926,7 @@
         <w:tc>
           <w:tcPr>
             <w:tcW w:type="dxa" w:w="1000"/>
-            <w:shd w:fill="F1F5F3" w:color="auto" w:val="clear"/>
+            <w:shd w:fill="F1F8F4" w:color="auto" w:val="clear"/>
             <w:tcMar>
               <w:top w:type="dxa" w:w="70"/>
               <w:left w:type="dxa" w:w="120"/>
@@ -2898,9 +2943,9 @@
                 <w:rFonts w:ascii="Calibri" w:cs="Calibri" w:eastAsia="Calibri" w:hAnsi="Calibri"/>
                 <w:b w:val="false"/>
                 <w:bCs w:val="false"/>
-                <w:color w:val="233139"/>
-                <w:sz w:val="20"/>
-                <w:szCs w:val="20"/>
+                <w:color w:val="23423C"/>
+                <w:sz w:val="22"/>
+                <w:szCs w:val="22"/>
               </w:rPr>
               <w:t xml:space="preserve">☐</w:t>
             </w:r>
@@ -2909,7 +2954,7 @@
         <w:tc>
           <w:tcPr>
             <w:tcW w:type="dxa" w:w="1000"/>
-            <w:shd w:fill="F1F5F3" w:color="auto" w:val="clear"/>
+            <w:shd w:fill="F1F8F4" w:color="auto" w:val="clear"/>
             <w:tcMar>
               <w:top w:type="dxa" w:w="70"/>
               <w:left w:type="dxa" w:w="120"/>
@@ -2926,9 +2971,9 @@
                 <w:rFonts w:ascii="Calibri" w:cs="Calibri" w:eastAsia="Calibri" w:hAnsi="Calibri"/>
                 <w:b w:val="false"/>
                 <w:bCs w:val="false"/>
-                <w:color w:val="233139"/>
-                <w:sz w:val="20"/>
-                <w:szCs w:val="20"/>
+                <w:color w:val="23423C"/>
+                <w:sz w:val="22"/>
+                <w:szCs w:val="22"/>
               </w:rPr>
               <w:t xml:space="preserve">☐</w:t>
             </w:r>
@@ -2937,7 +2982,7 @@
         <w:tc>
           <w:tcPr>
             <w:tcW w:type="dxa" w:w="1000"/>
-            <w:shd w:fill="F1F5F3" w:color="auto" w:val="clear"/>
+            <w:shd w:fill="F1F8F4" w:color="auto" w:val="clear"/>
             <w:tcMar>
               <w:top w:type="dxa" w:w="70"/>
               <w:left w:type="dxa" w:w="120"/>
@@ -2954,9 +2999,9 @@
                 <w:rFonts w:ascii="Calibri" w:cs="Calibri" w:eastAsia="Calibri" w:hAnsi="Calibri"/>
                 <w:b w:val="false"/>
                 <w:bCs w:val="false"/>
-                <w:color w:val="233139"/>
-                <w:sz w:val="20"/>
-                <w:szCs w:val="20"/>
+                <w:color w:val="23423C"/>
+                <w:sz w:val="22"/>
+                <w:szCs w:val="22"/>
               </w:rPr>
               <w:t xml:space="preserve">☐</w:t>
             </w:r>
@@ -2984,9 +3029,9 @@
                 <w:rFonts w:ascii="Calibri" w:cs="Calibri" w:eastAsia="Calibri" w:hAnsi="Calibri"/>
                 <w:b/>
                 <w:bCs/>
-                <w:color w:val="233139"/>
-                <w:sz w:val="20"/>
-                <w:szCs w:val="20"/>
+                <w:color w:val="23423C"/>
+                <w:sz w:val="22"/>
+                <w:szCs w:val="22"/>
               </w:rPr>
               <w:t xml:space="preserve">B hat Gefühle ernst genommen (nicht kleingeredet)</w:t>
             </w:r>
@@ -3012,9 +3057,9 @@
                 <w:rFonts w:ascii="Calibri" w:cs="Calibri" w:eastAsia="Calibri" w:hAnsi="Calibri"/>
                 <w:b w:val="false"/>
                 <w:bCs w:val="false"/>
-                <w:color w:val="233139"/>
-                <w:sz w:val="20"/>
-                <w:szCs w:val="20"/>
+                <w:color w:val="23423C"/>
+                <w:sz w:val="22"/>
+                <w:szCs w:val="22"/>
               </w:rPr>
               <w:t xml:space="preserve">☐</w:t>
             </w:r>
@@ -3040,9 +3085,9 @@
                 <w:rFonts w:ascii="Calibri" w:cs="Calibri" w:eastAsia="Calibri" w:hAnsi="Calibri"/>
                 <w:b w:val="false"/>
                 <w:bCs w:val="false"/>
-                <w:color w:val="233139"/>
-                <w:sz w:val="20"/>
-                <w:szCs w:val="20"/>
+                <w:color w:val="23423C"/>
+                <w:sz w:val="22"/>
+                <w:szCs w:val="22"/>
               </w:rPr>
               <w:t xml:space="preserve">☐</w:t>
             </w:r>
@@ -3068,9 +3113,9 @@
                 <w:rFonts w:ascii="Calibri" w:cs="Calibri" w:eastAsia="Calibri" w:hAnsi="Calibri"/>
                 <w:b w:val="false"/>
                 <w:bCs w:val="false"/>
-                <w:color w:val="233139"/>
-                <w:sz w:val="20"/>
-                <w:szCs w:val="20"/>
+                <w:color w:val="23423C"/>
+                <w:sz w:val="22"/>
+                <w:szCs w:val="22"/>
               </w:rPr>
               <w:t xml:space="preserve">☐</w:t>
             </w:r>
@@ -3081,7 +3126,7 @@
         <w:tc>
           <w:tcPr>
             <w:tcW w:type="dxa" w:w="6360"/>
-            <w:shd w:fill="F1F5F3" w:color="auto" w:val="clear"/>
+            <w:shd w:fill="F1F8F4" w:color="auto" w:val="clear"/>
             <w:tcMar>
               <w:top w:type="dxa" w:w="70"/>
               <w:left w:type="dxa" w:w="120"/>
@@ -3098,9 +3143,9 @@
                 <w:rFonts w:ascii="Calibri" w:cs="Calibri" w:eastAsia="Calibri" w:hAnsi="Calibri"/>
                 <w:b/>
                 <w:bCs/>
-                <w:color w:val="233139"/>
-                <w:sz w:val="20"/>
-                <w:szCs w:val="20"/>
+                <w:color w:val="23423C"/>
+                <w:sz w:val="22"/>
+                <w:szCs w:val="22"/>
               </w:rPr>
               <w:t xml:space="preserve">B hat Pausen/Stille ausgehalten</w:t>
             </w:r>
@@ -3109,7 +3154,7 @@
         <w:tc>
           <w:tcPr>
             <w:tcW w:type="dxa" w:w="1000"/>
-            <w:shd w:fill="F1F5F3" w:color="auto" w:val="clear"/>
+            <w:shd w:fill="F1F8F4" w:color="auto" w:val="clear"/>
             <w:tcMar>
               <w:top w:type="dxa" w:w="70"/>
               <w:left w:type="dxa" w:w="120"/>
@@ -3126,9 +3171,9 @@
                 <w:rFonts w:ascii="Calibri" w:cs="Calibri" w:eastAsia="Calibri" w:hAnsi="Calibri"/>
                 <w:b w:val="false"/>
                 <w:bCs w:val="false"/>
-                <w:color w:val="233139"/>
-                <w:sz w:val="20"/>
-                <w:szCs w:val="20"/>
+                <w:color w:val="23423C"/>
+                <w:sz w:val="22"/>
+                <w:szCs w:val="22"/>
               </w:rPr>
               <w:t xml:space="preserve">☐</w:t>
             </w:r>
@@ -3137,7 +3182,7 @@
         <w:tc>
           <w:tcPr>
             <w:tcW w:type="dxa" w:w="1000"/>
-            <w:shd w:fill="F1F5F3" w:color="auto" w:val="clear"/>
+            <w:shd w:fill="F1F8F4" w:color="auto" w:val="clear"/>
             <w:tcMar>
               <w:top w:type="dxa" w:w="70"/>
               <w:left w:type="dxa" w:w="120"/>
@@ -3154,9 +3199,9 @@
                 <w:rFonts w:ascii="Calibri" w:cs="Calibri" w:eastAsia="Calibri" w:hAnsi="Calibri"/>
                 <w:b w:val="false"/>
                 <w:bCs w:val="false"/>
-                <w:color w:val="233139"/>
-                <w:sz w:val="20"/>
-                <w:szCs w:val="20"/>
+                <w:color w:val="23423C"/>
+                <w:sz w:val="22"/>
+                <w:szCs w:val="22"/>
               </w:rPr>
               <w:t xml:space="preserve">☐</w:t>
             </w:r>
@@ -3165,7 +3210,7 @@
         <w:tc>
           <w:tcPr>
             <w:tcW w:type="dxa" w:w="1000"/>
-            <w:shd w:fill="F1F5F3" w:color="auto" w:val="clear"/>
+            <w:shd w:fill="F1F8F4" w:color="auto" w:val="clear"/>
             <w:tcMar>
               <w:top w:type="dxa" w:w="70"/>
               <w:left w:type="dxa" w:w="120"/>
@@ -3182,9 +3227,9 @@
                 <w:rFonts w:ascii="Calibri" w:cs="Calibri" w:eastAsia="Calibri" w:hAnsi="Calibri"/>
                 <w:b w:val="false"/>
                 <w:bCs w:val="false"/>
-                <w:color w:val="233139"/>
-                <w:sz w:val="20"/>
-                <w:szCs w:val="20"/>
+                <w:color w:val="23423C"/>
+                <w:sz w:val="22"/>
+                <w:szCs w:val="22"/>
               </w:rPr>
               <w:t xml:space="preserve">☐</w:t>
             </w:r>
@@ -3212,9 +3257,9 @@
                 <w:rFonts w:ascii="Calibri" w:cs="Calibri" w:eastAsia="Calibri" w:hAnsi="Calibri"/>
                 <w:b/>
                 <w:bCs/>
-                <w:color w:val="233139"/>
-                <w:sz w:val="20"/>
-                <w:szCs w:val="20"/>
+                <w:color w:val="23423C"/>
+                <w:sz w:val="22"/>
+                <w:szCs w:val="22"/>
               </w:rPr>
               <w:t xml:space="preserve">B hat auf schnelle Ratschläge verzichtet</w:t>
             </w:r>
@@ -3240,9 +3285,9 @@
                 <w:rFonts w:ascii="Calibri" w:cs="Calibri" w:eastAsia="Calibri" w:hAnsi="Calibri"/>
                 <w:b w:val="false"/>
                 <w:bCs w:val="false"/>
-                <w:color w:val="233139"/>
-                <w:sz w:val="20"/>
-                <w:szCs w:val="20"/>
+                <w:color w:val="23423C"/>
+                <w:sz w:val="22"/>
+                <w:szCs w:val="22"/>
               </w:rPr>
               <w:t xml:space="preserve">☐</w:t>
             </w:r>
@@ -3268,9 +3313,9 @@
                 <w:rFonts w:ascii="Calibri" w:cs="Calibri" w:eastAsia="Calibri" w:hAnsi="Calibri"/>
                 <w:b w:val="false"/>
                 <w:bCs w:val="false"/>
-                <w:color w:val="233139"/>
-                <w:sz w:val="20"/>
-                <w:szCs w:val="20"/>
+                <w:color w:val="23423C"/>
+                <w:sz w:val="22"/>
+                <w:szCs w:val="22"/>
               </w:rPr>
               <w:t xml:space="preserve">☐</w:t>
             </w:r>
@@ -3296,9 +3341,9 @@
                 <w:rFonts w:ascii="Calibri" w:cs="Calibri" w:eastAsia="Calibri" w:hAnsi="Calibri"/>
                 <w:b w:val="false"/>
                 <w:bCs w:val="false"/>
-                <w:color w:val="233139"/>
-                <w:sz w:val="20"/>
-                <w:szCs w:val="20"/>
+                <w:color w:val="23423C"/>
+                <w:sz w:val="22"/>
+                <w:szCs w:val="22"/>
               </w:rPr>
               <w:t xml:space="preserve">☐</w:t>
             </w:r>
@@ -3309,7 +3354,7 @@
         <w:tc>
           <w:tcPr>
             <w:tcW w:type="dxa" w:w="6360"/>
-            <w:shd w:fill="F1F5F3" w:color="auto" w:val="clear"/>
+            <w:shd w:fill="F1F8F4" w:color="auto" w:val="clear"/>
             <w:tcMar>
               <w:top w:type="dxa" w:w="70"/>
               <w:left w:type="dxa" w:w="120"/>
@@ -3326,9 +3371,9 @@
                 <w:rFonts w:ascii="Calibri" w:cs="Calibri" w:eastAsia="Calibri" w:hAnsi="Calibri"/>
                 <w:b/>
                 <w:bCs/>
-                <w:color w:val="233139"/>
-                <w:sz w:val="20"/>
-                <w:szCs w:val="20"/>
+                <w:color w:val="23423C"/>
+                <w:sz w:val="22"/>
+                <w:szCs w:val="22"/>
               </w:rPr>
               <w:t xml:space="preserve">B hat konkret gefragt (z. B. „Was würde dir helfen?“)</w:t>
             </w:r>
@@ -3337,7 +3382,7 @@
         <w:tc>
           <w:tcPr>
             <w:tcW w:type="dxa" w:w="1000"/>
-            <w:shd w:fill="F1F5F3" w:color="auto" w:val="clear"/>
+            <w:shd w:fill="F1F8F4" w:color="auto" w:val="clear"/>
             <w:tcMar>
               <w:top w:type="dxa" w:w="70"/>
               <w:left w:type="dxa" w:w="120"/>
@@ -3354,9 +3399,9 @@
                 <w:rFonts w:ascii="Calibri" w:cs="Calibri" w:eastAsia="Calibri" w:hAnsi="Calibri"/>
                 <w:b w:val="false"/>
                 <w:bCs w:val="false"/>
-                <w:color w:val="233139"/>
-                <w:sz w:val="20"/>
-                <w:szCs w:val="20"/>
+                <w:color w:val="23423C"/>
+                <w:sz w:val="22"/>
+                <w:szCs w:val="22"/>
               </w:rPr>
               <w:t xml:space="preserve">☐</w:t>
             </w:r>
@@ -3365,7 +3410,7 @@
         <w:tc>
           <w:tcPr>
             <w:tcW w:type="dxa" w:w="1000"/>
-            <w:shd w:fill="F1F5F3" w:color="auto" w:val="clear"/>
+            <w:shd w:fill="F1F8F4" w:color="auto" w:val="clear"/>
             <w:tcMar>
               <w:top w:type="dxa" w:w="70"/>
               <w:left w:type="dxa" w:w="120"/>
@@ -3382,9 +3427,9 @@
                 <w:rFonts w:ascii="Calibri" w:cs="Calibri" w:eastAsia="Calibri" w:hAnsi="Calibri"/>
                 <w:b w:val="false"/>
                 <w:bCs w:val="false"/>
-                <w:color w:val="233139"/>
-                <w:sz w:val="20"/>
-                <w:szCs w:val="20"/>
+                <w:color w:val="23423C"/>
+                <w:sz w:val="22"/>
+                <w:szCs w:val="22"/>
               </w:rPr>
               <w:t xml:space="preserve">☐</w:t>
             </w:r>
@@ -3393,7 +3438,7 @@
         <w:tc>
           <w:tcPr>
             <w:tcW w:type="dxa" w:w="1000"/>
-            <w:shd w:fill="F1F5F3" w:color="auto" w:val="clear"/>
+            <w:shd w:fill="F1F8F4" w:color="auto" w:val="clear"/>
             <w:tcMar>
               <w:top w:type="dxa" w:w="70"/>
               <w:left w:type="dxa" w:w="120"/>
@@ -3410,9 +3455,9 @@
                 <w:rFonts w:ascii="Calibri" w:cs="Calibri" w:eastAsia="Calibri" w:hAnsi="Calibri"/>
                 <w:b w:val="false"/>
                 <w:bCs w:val="false"/>
-                <w:color w:val="233139"/>
-                <w:sz w:val="20"/>
-                <w:szCs w:val="20"/>
+                <w:color w:val="23423C"/>
+                <w:sz w:val="22"/>
+                <w:szCs w:val="22"/>
               </w:rPr>
               <w:t xml:space="preserve">☐</w:t>
             </w:r>
@@ -3440,9 +3485,9 @@
                 <w:rFonts w:ascii="Calibri" w:cs="Calibri" w:eastAsia="Calibri" w:hAnsi="Calibri"/>
                 <w:b/>
                 <w:bCs/>
-                <w:color w:val="233139"/>
-                <w:sz w:val="20"/>
-                <w:szCs w:val="20"/>
+                <w:color w:val="23423C"/>
+                <w:sz w:val="22"/>
+                <w:szCs w:val="22"/>
               </w:rPr>
               <w:t xml:space="preserve">A hat sich verstanden gefühlt (Eindruck)</w:t>
             </w:r>
@@ -3468,9 +3513,9 @@
                 <w:rFonts w:ascii="Calibri" w:cs="Calibri" w:eastAsia="Calibri" w:hAnsi="Calibri"/>
                 <w:b w:val="false"/>
                 <w:bCs w:val="false"/>
-                <w:color w:val="233139"/>
-                <w:sz w:val="20"/>
-                <w:szCs w:val="20"/>
+                <w:color w:val="23423C"/>
+                <w:sz w:val="22"/>
+                <w:szCs w:val="22"/>
               </w:rPr>
               <w:t xml:space="preserve">☐</w:t>
             </w:r>
@@ -3496,9 +3541,9 @@
                 <w:rFonts w:ascii="Calibri" w:cs="Calibri" w:eastAsia="Calibri" w:hAnsi="Calibri"/>
                 <w:b w:val="false"/>
                 <w:bCs w:val="false"/>
-                <w:color w:val="233139"/>
-                <w:sz w:val="20"/>
-                <w:szCs w:val="20"/>
+                <w:color w:val="23423C"/>
+                <w:sz w:val="22"/>
+                <w:szCs w:val="22"/>
               </w:rPr>
               <w:t xml:space="preserve">☐</w:t>
             </w:r>
@@ -3524,9 +3569,9 @@
                 <w:rFonts w:ascii="Calibri" w:cs="Calibri" w:eastAsia="Calibri" w:hAnsi="Calibri"/>
                 <w:b w:val="false"/>
                 <w:bCs w:val="false"/>
-                <w:color w:val="233139"/>
-                <w:sz w:val="20"/>
-                <w:szCs w:val="20"/>
+                <w:color w:val="23423C"/>
+                <w:sz w:val="22"/>
+                <w:szCs w:val="22"/>
               </w:rPr>
               <w:t xml:space="preserve">☐</w:t>
             </w:r>
@@ -3554,9 +3599,9 @@
       <w:r>
         <w:rPr>
           <w:rFonts w:ascii="Calibri" w:cs="Calibri" w:eastAsia="Calibri" w:hAnsi="Calibri"/>
-          <w:color w:val="233139"/>
-          <w:sz w:val="21"/>
-          <w:szCs w:val="21"/>
+          <w:color w:val="23423C"/>
+          <w:sz w:val="23"/>
+          <w:szCs w:val="23"/>
         </w:rPr>
         <w:t xml:space="preserve">Welcher Satz / Moment hat das Gespräch geöffnet?</w:t>
       </w:r>
@@ -3564,7 +3609,7 @@
     <w:p>
       <w:pPr>
         <w:pBdr>
-          <w:bottom w:val="single" w:color="5E6E73" w:sz="4" w:space="3"/>
+          <w:bottom w:val="single" w:color="5E736E" w:sz="4" w:space="3"/>
         </w:pBdr>
         <w:spacing w:after="200" w:before="60"/>
       </w:pPr>
@@ -3572,7 +3617,7 @@
     <w:p>
       <w:pPr>
         <w:pBdr>
-          <w:bottom w:val="single" w:color="5E6E73" w:sz="4" w:space="3"/>
+          <w:bottom w:val="single" w:color="5E736E" w:sz="4" w:space="3"/>
         </w:pBdr>
         <w:spacing w:after="200" w:before="60"/>
       </w:pPr>
@@ -3589,9 +3634,9 @@
       <w:r>
         <w:rPr>
           <w:rFonts w:ascii="Calibri" w:cs="Calibri" w:eastAsia="Calibri" w:hAnsi="Calibri"/>
-          <w:color w:val="233139"/>
-          <w:sz w:val="21"/>
-          <w:szCs w:val="21"/>
+          <w:color w:val="23423C"/>
+          <w:sz w:val="23"/>
+          <w:szCs w:val="23"/>
         </w:rPr>
         <w:t xml:space="preserve">Was hätte man anders machen können?</w:t>
       </w:r>
@@ -3599,7 +3644,7 @@
     <w:p>
       <w:pPr>
         <w:pBdr>
-          <w:bottom w:val="single" w:color="5E6E73" w:sz="4" w:space="3"/>
+          <w:bottom w:val="single" w:color="5E736E" w:sz="4" w:space="3"/>
         </w:pBdr>
         <w:spacing w:after="200" w:before="60"/>
       </w:pPr>
@@ -3607,7 +3652,7 @@
     <w:p>
       <w:pPr>
         <w:pBdr>
-          <w:bottom w:val="single" w:color="5E6E73" w:sz="4" w:space="3"/>
+          <w:bottom w:val="single" w:color="5E736E" w:sz="4" w:space="3"/>
         </w:pBdr>
         <w:spacing w:after="200" w:before="60"/>
       </w:pPr>
@@ -3632,9 +3677,9 @@
       <w:r>
         <w:rPr>
           <w:rFonts w:ascii="Calibri" w:cs="Calibri" w:eastAsia="Calibri" w:hAnsi="Calibri"/>
-          <w:color w:val="233139"/>
-          <w:sz w:val="21"/>
-          <w:szCs w:val="21"/>
+          <w:color w:val="23423C"/>
+          <w:sz w:val="23"/>
+          <w:szCs w:val="23"/>
         </w:rPr>
         <w:t xml:space="preserve">Je Gruppe ein Fall. Leitfragen: Was könnte hier los sein? · Was hilft? · Was sollte man vermeiden? · Wo sind die Grenzen der eigenen Hilfe? Ergebnisse auf Flipchart festhalten.</w:t>
       </w:r>
@@ -3648,7 +3693,7 @@
           <w:rFonts w:ascii="Cambria" w:cs="Cambria" w:eastAsia="Cambria" w:hAnsi="Cambria"/>
           <w:b/>
           <w:bCs/>
-          <w:color w:val="2E4A52"/>
+          <w:color w:val="2C7A6B"/>
           <w:sz w:val="23"/>
           <w:szCs w:val="23"/>
         </w:rPr>
@@ -3662,9 +3707,9 @@
       <w:r>
         <w:rPr>
           <w:rFonts w:ascii="Calibri" w:cs="Calibri" w:eastAsia="Calibri" w:hAnsi="Calibri"/>
-          <w:color w:val="233139"/>
-          <w:sz w:val="21"/>
-          <w:szCs w:val="21"/>
+          <w:color w:val="23423C"/>
+          <w:sz w:val="23"/>
+          <w:szCs w:val="23"/>
         </w:rPr>
         <w:t xml:space="preserve">Markus ist ein zuverlässiger Kollege. Seit einigen Monaten wirkt er gereizt, macht Fehler, zieht sich in Pausen zurück und meldet sich immer öfter krank. Auf Nachfragen sagt er nur: „Alles gut, viel Stress.“ Ihr sitzt mit ihm im Team.</w:t>
       </w:r>
@@ -3672,7 +3717,7 @@
     <w:p>
       <w:pPr>
         <w:pBdr>
-          <w:bottom w:val="single" w:color="DCE6E3" w:sz="4" w:space="3"/>
+          <w:bottom w:val="single" w:color="D9E9E1" w:sz="4" w:space="3"/>
         </w:pBdr>
         <w:spacing w:after="120"/>
       </w:pPr>
@@ -3686,7 +3731,7 @@
           <w:rFonts w:ascii="Cambria" w:cs="Cambria" w:eastAsia="Cambria" w:hAnsi="Cambria"/>
           <w:b/>
           <w:bCs/>
-          <w:color w:val="2E4A52"/>
+          <w:color w:val="2C7A6B"/>
           <w:sz w:val="23"/>
           <w:szCs w:val="23"/>
         </w:rPr>
@@ -3700,9 +3745,9 @@
       <w:r>
         <w:rPr>
           <w:rFonts w:ascii="Calibri" w:cs="Calibri" w:eastAsia="Calibri" w:hAnsi="Calibri"/>
-          <w:color w:val="233139"/>
-          <w:sz w:val="21"/>
-          <w:szCs w:val="21"/>
+          <w:color w:val="23423C"/>
+          <w:sz w:val="23"/>
+          <w:szCs w:val="23"/>
         </w:rPr>
         <w:t xml:space="preserve">Nach dem Tod ihrer Mutter hat sich Sabine völlig zurückgezogen. Sie geht kaum noch aus dem Haus, Einladungen sagt sie ab. Am Telefon klingt sie tonlos und sagt, sie sei „nur müde“. Du bist eine langjährige Freundin.</w:t>
       </w:r>
@@ -3710,7 +3755,7 @@
     <w:p>
       <w:pPr>
         <w:pBdr>
-          <w:bottom w:val="single" w:color="DCE6E3" w:sz="4" w:space="3"/>
+          <w:bottom w:val="single" w:color="D9E9E1" w:sz="4" w:space="3"/>
         </w:pBdr>
         <w:spacing w:after="120"/>
       </w:pPr>
@@ -3724,7 +3769,7 @@
           <w:rFonts w:ascii="Cambria" w:cs="Cambria" w:eastAsia="Cambria" w:hAnsi="Cambria"/>
           <w:b/>
           <w:bCs/>
-          <w:color w:val="2E4A52"/>
+          <w:color w:val="2C7A6B"/>
           <w:sz w:val="23"/>
           <w:szCs w:val="23"/>
         </w:rPr>
@@ -3738,9 +3783,9 @@
       <w:r>
         <w:rPr>
           <w:rFonts w:ascii="Calibri" w:cs="Calibri" w:eastAsia="Calibri" w:hAnsi="Calibri"/>
-          <w:color w:val="233139"/>
-          <w:sz w:val="21"/>
-          <w:szCs w:val="21"/>
+          <w:color w:val="23423C"/>
+          <w:sz w:val="23"/>
+          <w:szCs w:val="23"/>
         </w:rPr>
         <w:t xml:space="preserve">Jonas, dein jüngerer Bruder, hatte einen Autounfall miterlebt. Seither schläft er schlecht, schreckt bei Geräuschen zusammen und vermeidet das Autofahren. Er will „nicht drüber reden“ und winkt ab, wenn ihr das Thema ansprecht.</w:t>
       </w:r>
@@ -3748,7 +3793,7 @@
     <w:p>
       <w:pPr>
         <w:pBdr>
-          <w:bottom w:val="single" w:color="DCE6E3" w:sz="4" w:space="3"/>
+          <w:bottom w:val="single" w:color="D9E9E1" w:sz="4" w:space="3"/>
         </w:pBdr>
         <w:spacing w:after="120"/>
       </w:pPr>
@@ -3762,7 +3807,7 @@
           <w:rFonts w:ascii="Cambria" w:cs="Cambria" w:eastAsia="Cambria" w:hAnsi="Cambria"/>
           <w:b/>
           <w:bCs/>
-          <w:color w:val="2E4A52"/>
+          <w:color w:val="2C7A6B"/>
           <w:sz w:val="23"/>
           <w:szCs w:val="23"/>
         </w:rPr>
@@ -3776,9 +3821,9 @@
       <w:r>
         <w:rPr>
           <w:rFonts w:ascii="Calibri" w:cs="Calibri" w:eastAsia="Calibri" w:hAnsi="Calibri"/>
-          <w:color w:val="233139"/>
-          <w:sz w:val="21"/>
-          <w:szCs w:val="21"/>
+          <w:color w:val="23423C"/>
+          <w:sz w:val="23"/>
+          <w:szCs w:val="23"/>
         </w:rPr>
         <w:t xml:space="preserve">Eine Mitarbeiterin kommt nach mehrwöchigem Krankenstand wegen einer Depression zurück. Das Team ist unsicher: Soll man das Thema ansprechen? Wie verhält man sich „normal“, ohne sie zu überfordern oder auszugrenzen?</w:t>
       </w:r>
@@ -3786,7 +3831,7 @@
     <w:p>
       <w:pPr>
         <w:pBdr>
-          <w:bottom w:val="single" w:color="DCE6E3" w:sz="4" w:space="3"/>
+          <w:bottom w:val="single" w:color="D9E9E1" w:sz="4" w:space="3"/>
         </w:pBdr>
         <w:spacing w:after="120"/>
       </w:pPr>
@@ -3811,9 +3856,9 @@
       <w:r>
         <w:rPr>
           <w:rFonts w:ascii="Calibri" w:cs="Calibri" w:eastAsia="Calibri" w:hAnsi="Calibri"/>
-          <w:color w:val="233139"/>
-          <w:sz w:val="21"/>
-          <w:szCs w:val="21"/>
+          <w:color w:val="23423C"/>
+          <w:sz w:val="23"/>
+          <w:szCs w:val="23"/>
         </w:rPr>
         <w:t xml:space="preserve">Belastung zeigt sich oft ohne Worte – aber Signale sind mehrdeutig. Deuten Sie die folgenden Beschreibungen: Was könnte die Person fühlen? Was ist eindeutig, was nicht?</w:t>
       </w:r>
@@ -3822,12 +3867,12 @@
       <w:tblPr>
         <w:tblW w:type="dxa" w:w="9360"/>
         <w:tblBorders>
-          <w:top w:val="single" w:color="DCE6E3" w:sz="2"/>
-          <w:left w:val="single" w:color="DCE6E3" w:sz="2"/>
-          <w:bottom w:val="single" w:color="DCE6E3" w:sz="2"/>
-          <w:right w:val="single" w:color="DCE6E3" w:sz="2"/>
-          <w:insideH w:val="single" w:color="DCE6E3" w:sz="2"/>
-          <w:insideV w:val="single" w:color="DCE6E3" w:sz="2"/>
+          <w:top w:val="single" w:color="D9E9E1" w:sz="2"/>
+          <w:left w:val="single" w:color="D9E9E1" w:sz="2"/>
+          <w:bottom w:val="single" w:color="D9E9E1" w:sz="2"/>
+          <w:right w:val="single" w:color="D9E9E1" w:sz="2"/>
+          <w:insideH w:val="single" w:color="D9E9E1" w:sz="2"/>
+          <w:insideV w:val="single" w:color="D9E9E1" w:sz="2"/>
         </w:tblBorders>
       </w:tblPr>
       <w:tblGrid>
@@ -3841,7 +3886,7 @@
         <w:tc>
           <w:tcPr>
             <w:tcW w:type="dxa" w:w="4680"/>
-            <w:shd w:fill="2E4A52" w:color="auto" w:val="clear"/>
+            <w:shd w:fill="2C7A6B" w:color="auto" w:val="clear"/>
             <w:tcMar>
               <w:top w:type="dxa" w:w="80"/>
               <w:left w:type="dxa" w:w="120"/>
@@ -3859,8 +3904,8 @@
                 <w:b/>
                 <w:bCs/>
                 <w:color w:val="FFFFFF"/>
-                <w:sz w:val="20"/>
-                <w:szCs w:val="20"/>
+                <w:sz w:val="21"/>
+                <w:szCs w:val="21"/>
               </w:rPr>
               <w:t xml:space="preserve">Beschreibung</w:t>
             </w:r>
@@ -3869,7 +3914,7 @@
         <w:tc>
           <w:tcPr>
             <w:tcW w:type="dxa" w:w="4680"/>
-            <w:shd w:fill="2E4A52" w:color="auto" w:val="clear"/>
+            <w:shd w:fill="2C7A6B" w:color="auto" w:val="clear"/>
             <w:tcMar>
               <w:top w:type="dxa" w:w="80"/>
               <w:left w:type="dxa" w:w="120"/>
@@ -3887,8 +3932,8 @@
                 <w:b/>
                 <w:bCs/>
                 <w:color w:val="FFFFFF"/>
-                <w:sz w:val="20"/>
-                <w:szCs w:val="20"/>
+                <w:sz w:val="21"/>
+                <w:szCs w:val="21"/>
               </w:rPr>
               <w:t xml:space="preserve">Was könnte dahinterstecken?</w:t>
             </w:r>
@@ -3916,9 +3961,9 @@
                 <w:rFonts w:ascii="Calibri" w:cs="Calibri" w:eastAsia="Calibri" w:hAnsi="Calibri"/>
                 <w:b w:val="false"/>
                 <w:bCs w:val="false"/>
-                <w:color w:val="233139"/>
-                <w:sz w:val="20"/>
-                <w:szCs w:val="20"/>
+                <w:color w:val="23423C"/>
+                <w:sz w:val="22"/>
+                <w:szCs w:val="22"/>
               </w:rPr>
               <w:t xml:space="preserve">Lächelt in der Runde, aber die Schultern sind hochgezogen, die Hände kneten unter dem Tisch.</w:t>
             </w:r>
@@ -3944,9 +3989,9 @@
                 <w:rFonts w:ascii="Calibri" w:cs="Calibri" w:eastAsia="Calibri" w:hAnsi="Calibri"/>
                 <w:b w:val="false"/>
                 <w:bCs w:val="false"/>
-                <w:color w:val="233139"/>
-                <w:sz w:val="20"/>
-                <w:szCs w:val="20"/>
+                <w:color w:val="23423C"/>
+                <w:sz w:val="22"/>
+                <w:szCs w:val="22"/>
               </w:rPr>
               <w:t xml:space="preserve"/>
             </w:r>
@@ -3957,7 +4002,7 @@
         <w:tc>
           <w:tcPr>
             <w:tcW w:type="dxa" w:w="4680"/>
-            <w:shd w:fill="F1F5F3" w:color="auto" w:val="clear"/>
+            <w:shd w:fill="F1F8F4" w:color="auto" w:val="clear"/>
             <w:tcMar>
               <w:top w:type="dxa" w:w="70"/>
               <w:left w:type="dxa" w:w="120"/>
@@ -3974,9 +4019,9 @@
                 <w:rFonts w:ascii="Calibri" w:cs="Calibri" w:eastAsia="Calibri" w:hAnsi="Calibri"/>
                 <w:b w:val="false"/>
                 <w:bCs w:val="false"/>
-                <w:color w:val="233139"/>
-                <w:sz w:val="20"/>
-                <w:szCs w:val="20"/>
+                <w:color w:val="23423C"/>
+                <w:sz w:val="22"/>
+                <w:szCs w:val="22"/>
               </w:rPr>
               <w:t xml:space="preserve">Kommt zu spät, wirkt gehetzt, vermeidet Blickkontakt, antwortet einsilbig.</w:t>
             </w:r>
@@ -3985,7 +4030,7 @@
         <w:tc>
           <w:tcPr>
             <w:tcW w:type="dxa" w:w="4680"/>
-            <w:shd w:fill="F1F5F3" w:color="auto" w:val="clear"/>
+            <w:shd w:fill="F1F8F4" w:color="auto" w:val="clear"/>
             <w:tcMar>
               <w:top w:type="dxa" w:w="70"/>
               <w:left w:type="dxa" w:w="120"/>
@@ -4002,9 +4047,9 @@
                 <w:rFonts w:ascii="Calibri" w:cs="Calibri" w:eastAsia="Calibri" w:hAnsi="Calibri"/>
                 <w:b w:val="false"/>
                 <w:bCs w:val="false"/>
-                <w:color w:val="233139"/>
-                <w:sz w:val="20"/>
-                <w:szCs w:val="20"/>
+                <w:color w:val="23423C"/>
+                <w:sz w:val="22"/>
+                <w:szCs w:val="22"/>
               </w:rPr>
               <w:t xml:space="preserve"/>
             </w:r>
@@ -4032,9 +4077,9 @@
                 <w:rFonts w:ascii="Calibri" w:cs="Calibri" w:eastAsia="Calibri" w:hAnsi="Calibri"/>
                 <w:b w:val="false"/>
                 <w:bCs w:val="false"/>
-                <w:color w:val="233139"/>
-                <w:sz w:val="20"/>
-                <w:szCs w:val="20"/>
+                <w:color w:val="23423C"/>
+                <w:sz w:val="22"/>
+                <w:szCs w:val="22"/>
               </w:rPr>
               <w:t xml:space="preserve">Sitzt zusammengesunken, Blick ins Leere, reagiert verzögert auf Ansprache.</w:t>
             </w:r>
@@ -4060,9 +4105,9 @@
                 <w:rFonts w:ascii="Calibri" w:cs="Calibri" w:eastAsia="Calibri" w:hAnsi="Calibri"/>
                 <w:b w:val="false"/>
                 <w:bCs w:val="false"/>
-                <w:color w:val="233139"/>
-                <w:sz w:val="20"/>
-                <w:szCs w:val="20"/>
+                <w:color w:val="23423C"/>
+                <w:sz w:val="22"/>
+                <w:szCs w:val="22"/>
               </w:rPr>
               <w:t xml:space="preserve"/>
             </w:r>
@@ -4073,7 +4118,7 @@
         <w:tc>
           <w:tcPr>
             <w:tcW w:type="dxa" w:w="4680"/>
-            <w:shd w:fill="F1F5F3" w:color="auto" w:val="clear"/>
+            <w:shd w:fill="F1F8F4" w:color="auto" w:val="clear"/>
             <w:tcMar>
               <w:top w:type="dxa" w:w="70"/>
               <w:left w:type="dxa" w:w="120"/>
@@ -4090,9 +4135,9 @@
                 <w:rFonts w:ascii="Calibri" w:cs="Calibri" w:eastAsia="Calibri" w:hAnsi="Calibri"/>
                 <w:b w:val="false"/>
                 <w:bCs w:val="false"/>
-                <w:color w:val="233139"/>
-                <w:sz w:val="20"/>
-                <w:szCs w:val="20"/>
+                <w:color w:val="23423C"/>
+                <w:sz w:val="22"/>
+                <w:szCs w:val="22"/>
               </w:rPr>
               <w:t xml:space="preserve">Wirkt überdreht heiter, redet sehr schnell und viel, kann kaum still sitzen.</w:t>
             </w:r>
@@ -4101,7 +4146,7 @@
         <w:tc>
           <w:tcPr>
             <w:tcW w:type="dxa" w:w="4680"/>
-            <w:shd w:fill="F1F5F3" w:color="auto" w:val="clear"/>
+            <w:shd w:fill="F1F8F4" w:color="auto" w:val="clear"/>
             <w:tcMar>
               <w:top w:type="dxa" w:w="70"/>
               <w:left w:type="dxa" w:w="120"/>
@@ -4118,9 +4163,9 @@
                 <w:rFonts w:ascii="Calibri" w:cs="Calibri" w:eastAsia="Calibri" w:hAnsi="Calibri"/>
                 <w:b w:val="false"/>
                 <w:bCs w:val="false"/>
-                <w:color w:val="233139"/>
-                <w:sz w:val="20"/>
-                <w:szCs w:val="20"/>
+                <w:color w:val="23423C"/>
+                <w:sz w:val="22"/>
+                <w:szCs w:val="22"/>
               </w:rPr>
               <w:t xml:space="preserve"/>
             </w:r>
@@ -4148,9 +4193,9 @@
                 <w:rFonts w:ascii="Calibri" w:cs="Calibri" w:eastAsia="Calibri" w:hAnsi="Calibri"/>
                 <w:b w:val="false"/>
                 <w:bCs w:val="false"/>
-                <w:color w:val="233139"/>
-                <w:sz w:val="20"/>
-                <w:szCs w:val="20"/>
+                <w:color w:val="23423C"/>
+                <w:sz w:val="22"/>
+                <w:szCs w:val="22"/>
               </w:rPr>
               <w:t xml:space="preserve">Zieht sich körperlich zurück, verschränkt die Arme, dreht den Körper zur Tür.</w:t>
             </w:r>
@@ -4176,9 +4221,9 @@
                 <w:rFonts w:ascii="Calibri" w:cs="Calibri" w:eastAsia="Calibri" w:hAnsi="Calibri"/>
                 <w:b w:val="false"/>
                 <w:bCs w:val="false"/>
-                <w:color w:val="233139"/>
-                <w:sz w:val="20"/>
-                <w:szCs w:val="20"/>
+                <w:color w:val="23423C"/>
+                <w:sz w:val="22"/>
+                <w:szCs w:val="22"/>
               </w:rPr>
               <w:t xml:space="preserve"/>
             </w:r>
@@ -4190,10 +4235,10 @@
       <w:tblPr>
         <w:tblW w:type="dxa" w:w="9360"/>
         <w:tblBorders>
-          <w:top w:val="single" w:color="EAF1EF" w:sz="2"/>
-          <w:left w:val="single" w:color="3F7C79" w:sz="18"/>
-          <w:bottom w:val="single" w:color="EAF1EF" w:sz="2"/>
-          <w:right w:val="single" w:color="EAF1EF" w:sz="2"/>
+          <w:top w:val="single" w:color="E6F2EC" w:sz="2"/>
+          <w:left w:val="single" w:color="2E9284" w:sz="18"/>
+          <w:bottom w:val="single" w:color="E6F2EC" w:sz="2"/>
+          <w:right w:val="single" w:color="E6F2EC" w:sz="2"/>
           <w:insideH w:val="none"/>
           <w:insideV w:val="none"/>
         </w:tblBorders>
@@ -4205,7 +4250,7 @@
         <w:tc>
           <w:tcPr>
             <w:tcW w:type="dxa" w:w="9360"/>
-            <w:shd w:fill="EAF1EF" w:color="auto" w:val="clear"/>
+            <w:shd w:fill="E6F2EC" w:color="auto" w:val="clear"/>
             <w:tcMar>
               <w:top w:type="dxa" w:w="140"/>
               <w:left w:type="dxa" w:w="200"/>
@@ -4222,9 +4267,9 @@
                 <w:rFonts w:ascii="Cambria" w:cs="Cambria" w:eastAsia="Cambria" w:hAnsi="Cambria"/>
                 <w:b/>
                 <w:bCs/>
-                <w:color w:val="3F7C79"/>
-                <w:sz w:val="22"/>
-                <w:szCs w:val="22"/>
+                <w:color w:val="2E9284"/>
+                <w:sz w:val="24"/>
+                <w:szCs w:val="24"/>
               </w:rPr>
               <w:t xml:space="preserve">Wichtig</w:t>
             </w:r>
@@ -4236,9 +4281,9 @@
             <w:r>
               <w:rPr>
                 <w:rFonts w:ascii="Calibri" w:cs="Calibri" w:eastAsia="Calibri" w:hAnsi="Calibri"/>
-                <w:color w:val="233139"/>
-                <w:sz w:val="21"/>
-                <w:szCs w:val="21"/>
+                <w:color w:val="23423C"/>
+                <w:sz w:val="23"/>
+                <w:szCs w:val="23"/>
               </w:rPr>
               <w:t xml:space="preserve">Körpersprache ist ein Hinweis, kein Beweis. Der einzig sichere Weg führt über das nachfragende, wertschätzende Gespräch – nicht über Interpretation.</w:t>
             </w:r>
@@ -4266,9 +4311,9 @@
       <w:r>
         <w:rPr>
           <w:rFonts w:ascii="Calibri" w:cs="Calibri" w:eastAsia="Calibri" w:hAnsi="Calibri"/>
-          <w:color w:val="233139"/>
-          <w:sz w:val="21"/>
-          <w:szCs w:val="21"/>
+          <w:color w:val="23423C"/>
+          <w:sz w:val="23"/>
+          <w:szCs w:val="23"/>
         </w:rPr>
         <w:t xml:space="preserve">Ein einfaches Frühwarn-Bild. Der Bogen ist privat und bleibt bei Ihnen. Es geht um Selbstwahrnehmung, nicht um Bewertung.</w:t>
       </w:r>
@@ -4282,7 +4327,7 @@
           <w:rFonts w:ascii="Cambria" w:cs="Cambria" w:eastAsia="Cambria" w:hAnsi="Cambria"/>
           <w:b/>
           <w:bCs/>
-          <w:color w:val="B9793B"/>
+          <w:color w:val="BC722A"/>
           <w:sz w:val="21"/>
           <w:szCs w:val="21"/>
         </w:rPr>
@@ -4293,12 +4338,12 @@
       <w:tblPr>
         <w:tblW w:type="dxa" w:w="9360"/>
         <w:tblBorders>
-          <w:top w:val="single" w:color="DCE6E3" w:sz="2"/>
-          <w:left w:val="single" w:color="DCE6E3" w:sz="2"/>
-          <w:bottom w:val="single" w:color="DCE6E3" w:sz="2"/>
-          <w:right w:val="single" w:color="DCE6E3" w:sz="2"/>
+          <w:top w:val="single" w:color="D9E9E1" w:sz="2"/>
+          <w:left w:val="single" w:color="D9E9E1" w:sz="2"/>
+          <w:bottom w:val="single" w:color="D9E9E1" w:sz="2"/>
+          <w:right w:val="single" w:color="D9E9E1" w:sz="2"/>
           <w:insideH w:val="single" w:color="auto" w:sz="4"/>
-          <w:insideV w:val="single" w:color="DCE6E3" w:sz="2"/>
+          <w:insideV w:val="single" w:color="D9E9E1" w:sz="2"/>
         </w:tblBorders>
       </w:tblPr>
       <w:tblGrid>
@@ -4309,7 +4354,7 @@
         <w:tc>
           <w:tcPr>
             <w:tcW w:type="dxa" w:w="1500"/>
-            <w:shd w:fill="6E9B85" w:color="auto" w:val="clear"/>
+            <w:shd w:fill="5CA98A" w:color="auto" w:val="clear"/>
             <w:tcMar>
               <w:top w:type="dxa" w:w="120"/>
               <w:left w:type="dxa" w:w="120"/>
@@ -4352,7 +4397,7 @@
             <w:r>
               <w:rPr>
                 <w:rFonts w:ascii="Calibri" w:cs="Calibri" w:eastAsia="Calibri" w:hAnsi="Calibri"/>
-                <w:color w:val="233139"/>
+                <w:color w:val="23423C"/>
                 <w:sz w:val="20"/>
                 <w:szCs w:val="20"/>
               </w:rPr>
@@ -4371,12 +4416,12 @@
       <w:tblPr>
         <w:tblW w:type="dxa" w:w="9360"/>
         <w:tblBorders>
-          <w:top w:val="single" w:color="DCE6E3" w:sz="2"/>
-          <w:left w:val="single" w:color="DCE6E3" w:sz="2"/>
-          <w:bottom w:val="single" w:color="DCE6E3" w:sz="2"/>
-          <w:right w:val="single" w:color="DCE6E3" w:sz="2"/>
+          <w:top w:val="single" w:color="D9E9E1" w:sz="2"/>
+          <w:left w:val="single" w:color="D9E9E1" w:sz="2"/>
+          <w:bottom w:val="single" w:color="D9E9E1" w:sz="2"/>
+          <w:right w:val="single" w:color="D9E9E1" w:sz="2"/>
           <w:insideH w:val="single" w:color="auto" w:sz="4"/>
-          <w:insideV w:val="single" w:color="DCE6E3" w:sz="2"/>
+          <w:insideV w:val="single" w:color="D9E9E1" w:sz="2"/>
         </w:tblBorders>
       </w:tblPr>
       <w:tblGrid>
@@ -4387,7 +4432,7 @@
         <w:tc>
           <w:tcPr>
             <w:tcW w:type="dxa" w:w="1500"/>
-            <w:shd w:fill="B9793B" w:color="auto" w:val="clear"/>
+            <w:shd w:fill="BC722A" w:color="auto" w:val="clear"/>
             <w:tcMar>
               <w:top w:type="dxa" w:w="120"/>
               <w:left w:type="dxa" w:w="120"/>
@@ -4430,7 +4475,7 @@
             <w:r>
               <w:rPr>
                 <w:rFonts w:ascii="Calibri" w:cs="Calibri" w:eastAsia="Calibri" w:hAnsi="Calibri"/>
-                <w:color w:val="233139"/>
+                <w:color w:val="23423C"/>
                 <w:sz w:val="20"/>
                 <w:szCs w:val="20"/>
               </w:rPr>
@@ -4449,12 +4494,12 @@
       <w:tblPr>
         <w:tblW w:type="dxa" w:w="9360"/>
         <w:tblBorders>
-          <w:top w:val="single" w:color="DCE6E3" w:sz="2"/>
-          <w:left w:val="single" w:color="DCE6E3" w:sz="2"/>
-          <w:bottom w:val="single" w:color="DCE6E3" w:sz="2"/>
-          <w:right w:val="single" w:color="DCE6E3" w:sz="2"/>
+          <w:top w:val="single" w:color="D9E9E1" w:sz="2"/>
+          <w:left w:val="single" w:color="D9E9E1" w:sz="2"/>
+          <w:bottom w:val="single" w:color="D9E9E1" w:sz="2"/>
+          <w:right w:val="single" w:color="D9E9E1" w:sz="2"/>
           <w:insideH w:val="single" w:color="auto" w:sz="4"/>
-          <w:insideV w:val="single" w:color="DCE6E3" w:sz="2"/>
+          <w:insideV w:val="single" w:color="D9E9E1" w:sz="2"/>
         </w:tblBorders>
       </w:tblPr>
       <w:tblGrid>
@@ -4508,7 +4553,7 @@
             <w:r>
               <w:rPr>
                 <w:rFonts w:ascii="Calibri" w:cs="Calibri" w:eastAsia="Calibri" w:hAnsi="Calibri"/>
-                <w:color w:val="233139"/>
+                <w:color w:val="23423C"/>
                 <w:sz w:val="20"/>
                 <w:szCs w:val="20"/>
               </w:rPr>
@@ -4533,9 +4578,9 @@
       <w:r>
         <w:rPr>
           <w:rFonts w:ascii="Calibri" w:cs="Calibri" w:eastAsia="Calibri" w:hAnsi="Calibri"/>
-          <w:color w:val="233139"/>
-          <w:sz w:val="21"/>
-          <w:szCs w:val="21"/>
+          <w:color w:val="23423C"/>
+          <w:sz w:val="23"/>
+          <w:szCs w:val="23"/>
         </w:rPr>
         <w:t xml:space="preserve">Wo stehe ich gerade?   ☐ Grün    ☐ Gelb    ☐ Rot</w:t>
       </w:r>
@@ -4552,9 +4597,9 @@
       <w:r>
         <w:rPr>
           <w:rFonts w:ascii="Calibri" w:cs="Calibri" w:eastAsia="Calibri" w:hAnsi="Calibri"/>
-          <w:color w:val="233139"/>
-          <w:sz w:val="21"/>
-          <w:szCs w:val="21"/>
+          <w:color w:val="23423C"/>
+          <w:sz w:val="23"/>
+          <w:szCs w:val="23"/>
         </w:rPr>
         <w:t xml:space="preserve">Woran erkenne ich mein „Gelb“? (persönliche Frühwarnsignale)</w:t>
       </w:r>
@@ -4562,7 +4607,7 @@
     <w:p>
       <w:pPr>
         <w:pBdr>
-          <w:bottom w:val="single" w:color="5E6E73" w:sz="4" w:space="3"/>
+          <w:bottom w:val="single" w:color="5E736E" w:sz="4" w:space="3"/>
         </w:pBdr>
         <w:spacing w:after="200" w:before="60"/>
       </w:pPr>
@@ -4570,7 +4615,7 @@
     <w:p>
       <w:pPr>
         <w:pBdr>
-          <w:bottom w:val="single" w:color="5E6E73" w:sz="4" w:space="3"/>
+          <w:bottom w:val="single" w:color="5E736E" w:sz="4" w:space="3"/>
         </w:pBdr>
         <w:spacing w:after="200" w:before="60"/>
       </w:pPr>
@@ -4587,9 +4632,9 @@
       <w:r>
         <w:rPr>
           <w:rFonts w:ascii="Calibri" w:cs="Calibri" w:eastAsia="Calibri" w:hAnsi="Calibri"/>
-          <w:color w:val="233139"/>
-          <w:sz w:val="21"/>
-          <w:szCs w:val="21"/>
+          <w:color w:val="23423C"/>
+          <w:sz w:val="23"/>
+          <w:szCs w:val="23"/>
         </w:rPr>
         <w:t xml:space="preserve">Was hilft mir, von Gelb zurück zu Grün zu kommen?</w:t>
       </w:r>
@@ -4597,7 +4642,7 @@
     <w:p>
       <w:pPr>
         <w:pBdr>
-          <w:bottom w:val="single" w:color="5E6E73" w:sz="4" w:space="3"/>
+          <w:bottom w:val="single" w:color="5E736E" w:sz="4" w:space="3"/>
         </w:pBdr>
         <w:spacing w:after="200" w:before="60"/>
       </w:pPr>
@@ -4605,7 +4650,7 @@
     <w:p>
       <w:pPr>
         <w:pBdr>
-          <w:bottom w:val="single" w:color="5E6E73" w:sz="4" w:space="3"/>
+          <w:bottom w:val="single" w:color="5E736E" w:sz="4" w:space="3"/>
         </w:pBdr>
         <w:spacing w:after="200" w:before="60"/>
       </w:pPr>
@@ -4622,9 +4667,9 @@
       <w:r>
         <w:rPr>
           <w:rFonts w:ascii="Calibri" w:cs="Calibri" w:eastAsia="Calibri" w:hAnsi="Calibri"/>
-          <w:color w:val="233139"/>
-          <w:sz w:val="21"/>
-          <w:szCs w:val="21"/>
+          <w:color w:val="23423C"/>
+          <w:sz w:val="23"/>
+          <w:szCs w:val="23"/>
         </w:rPr>
         <w:t xml:space="preserve">Wen könnte ich in „Rot“ anrufen?</w:t>
       </w:r>
@@ -4632,7 +4677,7 @@
     <w:p>
       <w:pPr>
         <w:pBdr>
-          <w:bottom w:val="single" w:color="5E6E73" w:sz="4" w:space="3"/>
+          <w:bottom w:val="single" w:color="5E736E" w:sz="4" w:space="3"/>
         </w:pBdr>
         <w:spacing w:after="200" w:before="60"/>
       </w:pPr>
@@ -4657,9 +4702,9 @@
       <w:r>
         <w:rPr>
           <w:rFonts w:ascii="Calibri" w:cs="Calibri" w:eastAsia="Calibri" w:hAnsi="Calibri"/>
-          <w:color w:val="233139"/>
-          <w:sz w:val="21"/>
-          <w:szCs w:val="21"/>
+          <w:color w:val="23423C"/>
+          <w:sz w:val="23"/>
+          <w:szCs w:val="23"/>
         </w:rPr>
         <w:t xml:space="preserve">Zum Abschluss. Nehmen Sie sich ein paar ruhige Minuten. Der Bogen bleibt bei Ihnen.</w:t>
       </w:r>
@@ -4673,7 +4718,7 @@
           <w:rFonts w:ascii="Calibri" w:cs="Calibri" w:eastAsia="Calibri" w:hAnsi="Calibri"/>
           <w:b/>
           <w:bCs/>
-          <w:color w:val="2E4A52"/>
+          <w:color w:val="2C7A6B"/>
           <w:sz w:val="21"/>
           <w:szCs w:val="21"/>
         </w:rPr>
@@ -4683,7 +4728,7 @@
     <w:p>
       <w:pPr>
         <w:pBdr>
-          <w:bottom w:val="single" w:color="5E6E73" w:sz="4" w:space="3"/>
+          <w:bottom w:val="single" w:color="5E736E" w:sz="4" w:space="3"/>
         </w:pBdr>
         <w:spacing w:after="200" w:before="60"/>
       </w:pPr>
@@ -4691,7 +4736,7 @@
     <w:p>
       <w:pPr>
         <w:pBdr>
-          <w:bottom w:val="single" w:color="5E6E73" w:sz="4" w:space="3"/>
+          <w:bottom w:val="single" w:color="5E736E" w:sz="4" w:space="3"/>
         </w:pBdr>
         <w:spacing w:after="200" w:before="60"/>
       </w:pPr>
@@ -4705,7 +4750,7 @@
           <w:rFonts w:ascii="Calibri" w:cs="Calibri" w:eastAsia="Calibri" w:hAnsi="Calibri"/>
           <w:b/>
           <w:bCs/>
-          <w:color w:val="2E4A52"/>
+          <w:color w:val="2C7A6B"/>
           <w:sz w:val="21"/>
           <w:szCs w:val="21"/>
         </w:rPr>
@@ -4715,7 +4760,7 @@
     <w:p>
       <w:pPr>
         <w:pBdr>
-          <w:bottom w:val="single" w:color="5E6E73" w:sz="4" w:space="3"/>
+          <w:bottom w:val="single" w:color="5E736E" w:sz="4" w:space="3"/>
         </w:pBdr>
         <w:spacing w:after="200" w:before="60"/>
       </w:pPr>
@@ -4723,7 +4768,7 @@
     <w:p>
       <w:pPr>
         <w:pBdr>
-          <w:bottom w:val="single" w:color="5E6E73" w:sz="4" w:space="3"/>
+          <w:bottom w:val="single" w:color="5E736E" w:sz="4" w:space="3"/>
         </w:pBdr>
         <w:spacing w:after="200" w:before="60"/>
       </w:pPr>
@@ -4737,7 +4782,7 @@
           <w:rFonts w:ascii="Calibri" w:cs="Calibri" w:eastAsia="Calibri" w:hAnsi="Calibri"/>
           <w:b/>
           <w:bCs/>
-          <w:color w:val="2E4A52"/>
+          <w:color w:val="2C7A6B"/>
           <w:sz w:val="21"/>
           <w:szCs w:val="21"/>
         </w:rPr>
@@ -4747,7 +4792,7 @@
     <w:p>
       <w:pPr>
         <w:pBdr>
-          <w:bottom w:val="single" w:color="5E6E73" w:sz="4" w:space="3"/>
+          <w:bottom w:val="single" w:color="5E736E" w:sz="4" w:space="3"/>
         </w:pBdr>
         <w:spacing w:after="200" w:before="60"/>
       </w:pPr>
@@ -4755,7 +4800,7 @@
     <w:p>
       <w:pPr>
         <w:pBdr>
-          <w:bottom w:val="single" w:color="5E6E73" w:sz="4" w:space="3"/>
+          <w:bottom w:val="single" w:color="5E736E" w:sz="4" w:space="3"/>
         </w:pBdr>
         <w:spacing w:after="200" w:before="60"/>
       </w:pPr>
@@ -4769,7 +4814,7 @@
           <w:rFonts w:ascii="Calibri" w:cs="Calibri" w:eastAsia="Calibri" w:hAnsi="Calibri"/>
           <w:b/>
           <w:bCs/>
-          <w:color w:val="2E4A52"/>
+          <w:color w:val="2C7A6B"/>
           <w:sz w:val="21"/>
           <w:szCs w:val="21"/>
         </w:rPr>
@@ -4779,7 +4824,7 @@
     <w:p>
       <w:pPr>
         <w:pBdr>
-          <w:bottom w:val="single" w:color="5E6E73" w:sz="4" w:space="3"/>
+          <w:bottom w:val="single" w:color="5E736E" w:sz="4" w:space="3"/>
         </w:pBdr>
         <w:spacing w:after="200" w:before="60"/>
       </w:pPr>
@@ -4787,7 +4832,7 @@
     <w:p>
       <w:pPr>
         <w:pBdr>
-          <w:bottom w:val="single" w:color="5E6E73" w:sz="4" w:space="3"/>
+          <w:bottom w:val="single" w:color="5E736E" w:sz="4" w:space="3"/>
         </w:pBdr>
         <w:spacing w:after="200" w:before="60"/>
       </w:pPr>
@@ -4801,7 +4846,7 @@
           <w:rFonts w:ascii="Calibri" w:cs="Calibri" w:eastAsia="Calibri" w:hAnsi="Calibri"/>
           <w:b/>
           <w:bCs/>
-          <w:color w:val="2E4A52"/>
+          <w:color w:val="2C7A6B"/>
           <w:sz w:val="21"/>
           <w:szCs w:val="21"/>
         </w:rPr>
@@ -4811,7 +4856,7 @@
     <w:p>
       <w:pPr>
         <w:pBdr>
-          <w:bottom w:val="single" w:color="5E6E73" w:sz="4" w:space="3"/>
+          <w:bottom w:val="single" w:color="5E736E" w:sz="4" w:space="3"/>
         </w:pBdr>
         <w:spacing w:after="200" w:before="60"/>
       </w:pPr>
@@ -4819,7 +4864,7 @@
     <w:p>
       <w:pPr>
         <w:pBdr>
-          <w:bottom w:val="single" w:color="5E6E73" w:sz="4" w:space="3"/>
+          <w:bottom w:val="single" w:color="5E736E" w:sz="4" w:space="3"/>
         </w:pBdr>
         <w:spacing w:after="200" w:before="60"/>
       </w:pPr>
@@ -4833,7 +4878,7 @@
           <w:rFonts w:ascii="Calibri" w:cs="Calibri" w:eastAsia="Calibri" w:hAnsi="Calibri"/>
           <w:b/>
           <w:bCs/>
-          <w:color w:val="2E4A52"/>
+          <w:color w:val="2C7A6B"/>
           <w:sz w:val="21"/>
           <w:szCs w:val="21"/>
         </w:rPr>
@@ -4843,7 +4888,7 @@
     <w:p>
       <w:pPr>
         <w:pBdr>
-          <w:bottom w:val="single" w:color="5E6E73" w:sz="4" w:space="3"/>
+          <w:bottom w:val="single" w:color="5E736E" w:sz="4" w:space="3"/>
         </w:pBdr>
         <w:spacing w:after="200" w:before="60"/>
       </w:pPr>
@@ -4851,7 +4896,7 @@
     <w:p>
       <w:pPr>
         <w:pBdr>
-          <w:bottom w:val="single" w:color="5E6E73" w:sz="4" w:space="3"/>
+          <w:bottom w:val="single" w:color="5E736E" w:sz="4" w:space="3"/>
         </w:pBdr>
         <w:spacing w:after="200" w:before="60"/>
       </w:pPr>
@@ -4860,10 +4905,10 @@
       <w:tblPr>
         <w:tblW w:type="dxa" w:w="9360"/>
         <w:tblBorders>
-          <w:top w:val="single" w:color="EAF1EF" w:sz="2"/>
-          <w:left w:val="single" w:color="3F7C79" w:sz="18"/>
-          <w:bottom w:val="single" w:color="EAF1EF" w:sz="2"/>
-          <w:right w:val="single" w:color="EAF1EF" w:sz="2"/>
+          <w:top w:val="single" w:color="E6F2EC" w:sz="2"/>
+          <w:left w:val="single" w:color="2E9284" w:sz="18"/>
+          <w:bottom w:val="single" w:color="E6F2EC" w:sz="2"/>
+          <w:right w:val="single" w:color="E6F2EC" w:sz="2"/>
           <w:insideH w:val="none"/>
           <w:insideV w:val="none"/>
         </w:tblBorders>
@@ -4875,7 +4920,7 @@
         <w:tc>
           <w:tcPr>
             <w:tcW w:type="dxa" w:w="9360"/>
-            <w:shd w:fill="EAF1EF" w:color="auto" w:val="clear"/>
+            <w:shd w:fill="E6F2EC" w:color="auto" w:val="clear"/>
             <w:tcMar>
               <w:top w:type="dxa" w:w="140"/>
               <w:left w:type="dxa" w:w="200"/>
@@ -4892,9 +4937,9 @@
                 <w:rFonts w:ascii="Cambria" w:cs="Cambria" w:eastAsia="Cambria" w:hAnsi="Cambria"/>
                 <w:b/>
                 <w:bCs/>
-                <w:color w:val="3F7C79"/>
-                <w:sz w:val="22"/>
-                <w:szCs w:val="22"/>
+                <w:color w:val="2E9284"/>
+                <w:sz w:val="24"/>
+                <w:szCs w:val="24"/>
               </w:rPr>
               <w:t xml:space="preserve">Ein Satz zum Mitnehmen</w:t>
             </w:r>
@@ -4908,9 +4953,9 @@
                 <w:rFonts w:ascii="Calibri" w:cs="Calibri" w:eastAsia="Calibri" w:hAnsi="Calibri"/>
                 <w:i/>
                 <w:iCs/>
-                <w:color w:val="2E4A52"/>
-                <w:sz w:val="21"/>
-                <w:szCs w:val="21"/>
+                <w:color w:val="2C7A6B"/>
+                <w:sz w:val="23"/>
+                <w:szCs w:val="23"/>
               </w:rPr>
               <w:t xml:space="preserve">„Man sieht es einem nicht an. Aber jetzt weiß ich, wie man hinschaut – und was ein einziger verständnisvoller Mensch verändern kann.“</w:t>
             </w:r>
@@ -4935,10 +4980,10 @@
       <w:tblPr>
         <w:tblW w:type="dxa" w:w="9360"/>
         <w:tblBorders>
-          <w:top w:val="single" w:color="F6ECE0" w:sz="2"/>
-          <w:left w:val="single" w:color="B9793B" w:sz="18"/>
-          <w:bottom w:val="single" w:color="F6ECE0" w:sz="2"/>
-          <w:right w:val="single" w:color="F6ECE0" w:sz="2"/>
+          <w:top w:val="single" w:color="F8EEDD" w:sz="2"/>
+          <w:left w:val="single" w:color="BC722A" w:sz="18"/>
+          <w:bottom w:val="single" w:color="F8EEDD" w:sz="2"/>
+          <w:right w:val="single" w:color="F8EEDD" w:sz="2"/>
           <w:insideH w:val="none"/>
           <w:insideV w:val="none"/>
         </w:tblBorders>
@@ -4950,7 +4995,7 @@
         <w:tc>
           <w:tcPr>
             <w:tcW w:type="dxa" w:w="9360"/>
-            <w:shd w:fill="F6ECE0" w:color="auto" w:val="clear"/>
+            <w:shd w:fill="F8EEDD" w:color="auto" w:val="clear"/>
             <w:tcMar>
               <w:top w:type="dxa" w:w="140"/>
               <w:left w:type="dxa" w:w="200"/>
@@ -4967,9 +5012,9 @@
                 <w:rFonts w:ascii="Cambria" w:cs="Cambria" w:eastAsia="Cambria" w:hAnsi="Cambria"/>
                 <w:b/>
                 <w:bCs/>
-                <w:color w:val="B9793B"/>
-                <w:sz w:val="22"/>
-                <w:szCs w:val="22"/>
+                <w:color w:val="BC722A"/>
+                <w:sz w:val="24"/>
+                <w:szCs w:val="24"/>
               </w:rPr>
               <w:t xml:space="preserve">Im Notfall / bei akuter Krise</w:t>
             </w:r>
@@ -4983,7 +5028,7 @@
                 <w:rFonts w:ascii="Calibri" w:cs="Calibri" w:eastAsia="Calibri" w:hAnsi="Calibri"/>
                 <w:b/>
                 <w:bCs/>
-                <w:color w:val="B9793B"/>
+                <w:color w:val="BC722A"/>
                 <w:sz w:val="26"/>
                 <w:szCs w:val="26"/>
               </w:rPr>
@@ -4999,9 +5044,9 @@
                 <w:rFonts w:ascii="Calibri" w:cs="Calibri" w:eastAsia="Calibri" w:hAnsi="Calibri"/>
                 <w:i/>
                 <w:iCs/>
-                <w:color w:val="5E6E73"/>
-                <w:sz w:val="21"/>
-                <w:szCs w:val="21"/>
+                <w:color w:val="5E736E"/>
+                <w:sz w:val="23"/>
+                <w:szCs w:val="23"/>
               </w:rPr>
               <w:t xml:space="preserve">Telefonseelsorge 142 – rund um die Uhr, kostenlos, anonym.</w:t>
             </w:r>
@@ -5018,12 +5063,12 @@
       <w:tblPr>
         <w:tblW w:type="dxa" w:w="9360"/>
         <w:tblBorders>
-          <w:top w:val="single" w:color="DCE6E3" w:sz="2"/>
-          <w:left w:val="single" w:color="DCE6E3" w:sz="2"/>
-          <w:bottom w:val="single" w:color="DCE6E3" w:sz="2"/>
-          <w:right w:val="single" w:color="DCE6E3" w:sz="2"/>
-          <w:insideH w:val="single" w:color="DCE6E3" w:sz="2"/>
-          <w:insideV w:val="single" w:color="DCE6E3" w:sz="2"/>
+          <w:top w:val="single" w:color="D9E9E1" w:sz="2"/>
+          <w:left w:val="single" w:color="D9E9E1" w:sz="2"/>
+          <w:bottom w:val="single" w:color="D9E9E1" w:sz="2"/>
+          <w:right w:val="single" w:color="D9E9E1" w:sz="2"/>
+          <w:insideH w:val="single" w:color="D9E9E1" w:sz="2"/>
+          <w:insideV w:val="single" w:color="D9E9E1" w:sz="2"/>
         </w:tblBorders>
       </w:tblPr>
       <w:tblGrid>
@@ -5038,7 +5083,7 @@
         <w:tc>
           <w:tcPr>
             <w:tcW w:type="dxa" w:w="3000"/>
-            <w:shd w:fill="2E4A52" w:color="auto" w:val="clear"/>
+            <w:shd w:fill="2C7A6B" w:color="auto" w:val="clear"/>
             <w:tcMar>
               <w:top w:type="dxa" w:w="80"/>
               <w:left w:type="dxa" w:w="120"/>
@@ -5056,8 +5101,8 @@
                 <w:b/>
                 <w:bCs/>
                 <w:color w:val="FFFFFF"/>
-                <w:sz w:val="20"/>
-                <w:szCs w:val="20"/>
+                <w:sz w:val="21"/>
+                <w:szCs w:val="21"/>
               </w:rPr>
               <w:t xml:space="preserve">Angebot</w:t>
             </w:r>
@@ -5066,7 +5111,7 @@
         <w:tc>
           <w:tcPr>
             <w:tcW w:type="dxa" w:w="2400"/>
-            <w:shd w:fill="2E4A52" w:color="auto" w:val="clear"/>
+            <w:shd w:fill="2C7A6B" w:color="auto" w:val="clear"/>
             <w:tcMar>
               <w:top w:type="dxa" w:w="80"/>
               <w:left w:type="dxa" w:w="120"/>
@@ -5084,8 +5129,8 @@
                 <w:b/>
                 <w:bCs/>
                 <w:color w:val="FFFFFF"/>
-                <w:sz w:val="20"/>
-                <w:szCs w:val="20"/>
+                <w:sz w:val="21"/>
+                <w:szCs w:val="21"/>
               </w:rPr>
               <w:t xml:space="preserve">Kontakt</w:t>
             </w:r>
@@ -5094,7 +5139,7 @@
         <w:tc>
           <w:tcPr>
             <w:tcW w:type="dxa" w:w="3960"/>
-            <w:shd w:fill="2E4A52" w:color="auto" w:val="clear"/>
+            <w:shd w:fill="2C7A6B" w:color="auto" w:val="clear"/>
             <w:tcMar>
               <w:top w:type="dxa" w:w="80"/>
               <w:left w:type="dxa" w:w="120"/>
@@ -5112,8 +5157,8 @@
                 <w:b/>
                 <w:bCs/>
                 <w:color w:val="FFFFFF"/>
-                <w:sz w:val="20"/>
-                <w:szCs w:val="20"/>
+                <w:sz w:val="21"/>
+                <w:szCs w:val="21"/>
               </w:rPr>
               <w:t xml:space="preserve">Für wen / wann</w:t>
             </w:r>
@@ -5141,9 +5186,9 @@
                 <w:rFonts w:ascii="Calibri" w:cs="Calibri" w:eastAsia="Calibri" w:hAnsi="Calibri"/>
                 <w:b/>
                 <w:bCs/>
-                <w:color w:val="233139"/>
-                <w:sz w:val="20"/>
-                <w:szCs w:val="20"/>
+                <w:color w:val="23423C"/>
+                <w:sz w:val="22"/>
+                <w:szCs w:val="22"/>
               </w:rPr>
               <w:t xml:space="preserve">Telefonseelsorge</w:t>
             </w:r>
@@ -5169,9 +5214,9 @@
                 <w:rFonts w:ascii="Calibri" w:cs="Calibri" w:eastAsia="Calibri" w:hAnsi="Calibri"/>
                 <w:b w:val="false"/>
                 <w:bCs w:val="false"/>
-                <w:color w:val="233139"/>
-                <w:sz w:val="20"/>
-                <w:szCs w:val="20"/>
+                <w:color w:val="23423C"/>
+                <w:sz w:val="22"/>
+                <w:szCs w:val="22"/>
               </w:rPr>
               <w:t xml:space="preserve">142</w:t>
             </w:r>
@@ -5197,9 +5242,9 @@
                 <w:rFonts w:ascii="Calibri" w:cs="Calibri" w:eastAsia="Calibri" w:hAnsi="Calibri"/>
                 <w:b w:val="false"/>
                 <w:bCs w:val="false"/>
-                <w:color w:val="233139"/>
-                <w:sz w:val="20"/>
-                <w:szCs w:val="20"/>
+                <w:color w:val="23423C"/>
+                <w:sz w:val="22"/>
+                <w:szCs w:val="22"/>
               </w:rPr>
               <w:t xml:space="preserve">alle · 24 h · anonym, kostenlos</w:t>
             </w:r>
@@ -5210,7 +5255,7 @@
         <w:tc>
           <w:tcPr>
             <w:tcW w:type="dxa" w:w="3000"/>
-            <w:shd w:fill="F1F5F3" w:color="auto" w:val="clear"/>
+            <w:shd w:fill="F1F8F4" w:color="auto" w:val="clear"/>
             <w:tcMar>
               <w:top w:type="dxa" w:w="70"/>
               <w:left w:type="dxa" w:w="120"/>
@@ -5227,9 +5272,9 @@
                 <w:rFonts w:ascii="Calibri" w:cs="Calibri" w:eastAsia="Calibri" w:hAnsi="Calibri"/>
                 <w:b/>
                 <w:bCs/>
-                <w:color w:val="233139"/>
-                <w:sz w:val="20"/>
-                <w:szCs w:val="20"/>
+                <w:color w:val="23423C"/>
+                <w:sz w:val="22"/>
+                <w:szCs w:val="22"/>
               </w:rPr>
               <w:t xml:space="preserve">Rat auf Draht</w:t>
             </w:r>
@@ -5238,7 +5283,7 @@
         <w:tc>
           <w:tcPr>
             <w:tcW w:type="dxa" w:w="2400"/>
-            <w:shd w:fill="F1F5F3" w:color="auto" w:val="clear"/>
+            <w:shd w:fill="F1F8F4" w:color="auto" w:val="clear"/>
             <w:tcMar>
               <w:top w:type="dxa" w:w="70"/>
               <w:left w:type="dxa" w:w="120"/>
@@ -5255,9 +5300,9 @@
                 <w:rFonts w:ascii="Calibri" w:cs="Calibri" w:eastAsia="Calibri" w:hAnsi="Calibri"/>
                 <w:b w:val="false"/>
                 <w:bCs w:val="false"/>
-                <w:color w:val="233139"/>
-                <w:sz w:val="20"/>
-                <w:szCs w:val="20"/>
+                <w:color w:val="23423C"/>
+                <w:sz w:val="22"/>
+                <w:szCs w:val="22"/>
               </w:rPr>
               <w:t xml:space="preserve">147</w:t>
             </w:r>
@@ -5266,7 +5311,7 @@
         <w:tc>
           <w:tcPr>
             <w:tcW w:type="dxa" w:w="3960"/>
-            <w:shd w:fill="F1F5F3" w:color="auto" w:val="clear"/>
+            <w:shd w:fill="F1F8F4" w:color="auto" w:val="clear"/>
             <w:tcMar>
               <w:top w:type="dxa" w:w="70"/>
               <w:left w:type="dxa" w:w="120"/>
@@ -5283,9 +5328,9 @@
                 <w:rFonts w:ascii="Calibri" w:cs="Calibri" w:eastAsia="Calibri" w:hAnsi="Calibri"/>
                 <w:b w:val="false"/>
                 <w:bCs w:val="false"/>
-                <w:color w:val="233139"/>
-                <w:sz w:val="20"/>
-                <w:szCs w:val="20"/>
+                <w:color w:val="23423C"/>
+                <w:sz w:val="22"/>
+                <w:szCs w:val="22"/>
               </w:rPr>
               <w:t xml:space="preserve">Kinder &amp; Jugendliche · 24 h</w:t>
             </w:r>
@@ -5313,9 +5358,9 @@
                 <w:rFonts w:ascii="Calibri" w:cs="Calibri" w:eastAsia="Calibri" w:hAnsi="Calibri"/>
                 <w:b/>
                 <w:bCs/>
-                <w:color w:val="233139"/>
-                <w:sz w:val="20"/>
-                <w:szCs w:val="20"/>
+                <w:color w:val="23423C"/>
+                <w:sz w:val="22"/>
+                <w:szCs w:val="22"/>
               </w:rPr>
               <w:t xml:space="preserve">Ö3-Kummernummer</w:t>
             </w:r>
@@ -5341,9 +5386,9 @@
                 <w:rFonts w:ascii="Calibri" w:cs="Calibri" w:eastAsia="Calibri" w:hAnsi="Calibri"/>
                 <w:b w:val="false"/>
                 <w:bCs w:val="false"/>
-                <w:color w:val="233139"/>
-                <w:sz w:val="20"/>
-                <w:szCs w:val="20"/>
+                <w:color w:val="23423C"/>
+                <w:sz w:val="22"/>
+                <w:szCs w:val="22"/>
               </w:rPr>
               <w:t xml:space="preserve">116 123</w:t>
             </w:r>
@@ -5369,9 +5414,9 @@
                 <w:rFonts w:ascii="Calibri" w:cs="Calibri" w:eastAsia="Calibri" w:hAnsi="Calibri"/>
                 <w:b w:val="false"/>
                 <w:bCs w:val="false"/>
-                <w:color w:val="233139"/>
-                <w:sz w:val="20"/>
-                <w:szCs w:val="20"/>
+                <w:color w:val="23423C"/>
+                <w:sz w:val="22"/>
+                <w:szCs w:val="22"/>
               </w:rPr>
               <w:t xml:space="preserve">alle · täglich 16–24 Uhr</w:t>
             </w:r>
@@ -5382,7 +5427,7 @@
         <w:tc>
           <w:tcPr>
             <w:tcW w:type="dxa" w:w="3000"/>
-            <w:shd w:fill="F1F5F3" w:color="auto" w:val="clear"/>
+            <w:shd w:fill="F1F8F4" w:color="auto" w:val="clear"/>
             <w:tcMar>
               <w:top w:type="dxa" w:w="70"/>
               <w:left w:type="dxa" w:w="120"/>
@@ -5399,9 +5444,9 @@
                 <w:rFonts w:ascii="Calibri" w:cs="Calibri" w:eastAsia="Calibri" w:hAnsi="Calibri"/>
                 <w:b/>
                 <w:bCs/>
-                <w:color w:val="233139"/>
-                <w:sz w:val="20"/>
-                <w:szCs w:val="20"/>
+                <w:color w:val="23423C"/>
+                <w:sz w:val="22"/>
+                <w:szCs w:val="22"/>
               </w:rPr>
               <w:t xml:space="preserve">pro mente Austria</w:t>
             </w:r>
@@ -5410,7 +5455,7 @@
         <w:tc>
           <w:tcPr>
             <w:tcW w:type="dxa" w:w="2400"/>
-            <w:shd w:fill="F1F5F3" w:color="auto" w:val="clear"/>
+            <w:shd w:fill="F1F8F4" w:color="auto" w:val="clear"/>
             <w:tcMar>
               <w:top w:type="dxa" w:w="70"/>
               <w:left w:type="dxa" w:w="120"/>
@@ -5427,9 +5472,9 @@
                 <w:rFonts w:ascii="Calibri" w:cs="Calibri" w:eastAsia="Calibri" w:hAnsi="Calibri"/>
                 <w:b w:val="false"/>
                 <w:bCs w:val="false"/>
-                <w:color w:val="233139"/>
-                <w:sz w:val="20"/>
-                <w:szCs w:val="20"/>
+                <w:color w:val="23423C"/>
+                <w:sz w:val="22"/>
+                <w:szCs w:val="22"/>
               </w:rPr>
               <w:t xml:space="preserve">promente-austria.at</w:t>
             </w:r>
@@ -5438,7 +5483,7 @@
         <w:tc>
           <w:tcPr>
             <w:tcW w:type="dxa" w:w="3960"/>
-            <w:shd w:fill="F1F5F3" w:color="auto" w:val="clear"/>
+            <w:shd w:fill="F1F8F4" w:color="auto" w:val="clear"/>
             <w:tcMar>
               <w:top w:type="dxa" w:w="70"/>
               <w:left w:type="dxa" w:w="120"/>
@@ -5455,9 +5500,9 @@
                 <w:rFonts w:ascii="Calibri" w:cs="Calibri" w:eastAsia="Calibri" w:hAnsi="Calibri"/>
                 <w:b w:val="false"/>
                 <w:bCs w:val="false"/>
-                <w:color w:val="233139"/>
-                <w:sz w:val="20"/>
-                <w:szCs w:val="20"/>
+                <w:color w:val="23423C"/>
+                <w:sz w:val="22"/>
+                <w:szCs w:val="22"/>
               </w:rPr>
               <w:t xml:space="preserve">psychosoziale Beratung, bundesweit</w:t>
             </w:r>
@@ -5485,9 +5530,9 @@
                 <w:rFonts w:ascii="Calibri" w:cs="Calibri" w:eastAsia="Calibri" w:hAnsi="Calibri"/>
                 <w:b/>
                 <w:bCs/>
-                <w:color w:val="233139"/>
-                <w:sz w:val="20"/>
-                <w:szCs w:val="20"/>
+                <w:color w:val="23423C"/>
+                <w:sz w:val="22"/>
+                <w:szCs w:val="22"/>
               </w:rPr>
               <w:t xml:space="preserve">HPE Österreich</w:t>
             </w:r>
@@ -5513,9 +5558,9 @@
                 <w:rFonts w:ascii="Calibri" w:cs="Calibri" w:eastAsia="Calibri" w:hAnsi="Calibri"/>
                 <w:b w:val="false"/>
                 <w:bCs w:val="false"/>
-                <w:color w:val="233139"/>
-                <w:sz w:val="20"/>
-                <w:szCs w:val="20"/>
+                <w:color w:val="23423C"/>
+                <w:sz w:val="22"/>
+                <w:szCs w:val="22"/>
               </w:rPr>
               <w:t xml:space="preserve">hpe.at</w:t>
             </w:r>
@@ -5541,9 +5586,9 @@
                 <w:rFonts w:ascii="Calibri" w:cs="Calibri" w:eastAsia="Calibri" w:hAnsi="Calibri"/>
                 <w:b w:val="false"/>
                 <w:bCs w:val="false"/>
-                <w:color w:val="233139"/>
-                <w:sz w:val="20"/>
-                <w:szCs w:val="20"/>
+                <w:color w:val="23423C"/>
+                <w:sz w:val="22"/>
+                <w:szCs w:val="22"/>
               </w:rPr>
               <w:t xml:space="preserve">Angehörige psychisch erkrankter Menschen</w:t>
             </w:r>
@@ -5554,7 +5599,7 @@
         <w:tc>
           <w:tcPr>
             <w:tcW w:type="dxa" w:w="3000"/>
-            <w:shd w:fill="F1F5F3" w:color="auto" w:val="clear"/>
+            <w:shd w:fill="F1F8F4" w:color="auto" w:val="clear"/>
             <w:tcMar>
               <w:top w:type="dxa" w:w="70"/>
               <w:left w:type="dxa" w:w="120"/>
@@ -5571,9 +5616,9 @@
                 <w:rFonts w:ascii="Calibri" w:cs="Calibri" w:eastAsia="Calibri" w:hAnsi="Calibri"/>
                 <w:b/>
                 <w:bCs/>
-                <w:color w:val="233139"/>
-                <w:sz w:val="20"/>
-                <w:szCs w:val="20"/>
+                <w:color w:val="23423C"/>
+                <w:sz w:val="22"/>
+                <w:szCs w:val="22"/>
               </w:rPr>
               <w:t xml:space="preserve">Kriseninterventionszentrum Wien</w:t>
             </w:r>
@@ -5582,7 +5627,7 @@
         <w:tc>
           <w:tcPr>
             <w:tcW w:type="dxa" w:w="2400"/>
-            <w:shd w:fill="F1F5F3" w:color="auto" w:val="clear"/>
+            <w:shd w:fill="F1F8F4" w:color="auto" w:val="clear"/>
             <w:tcMar>
               <w:top w:type="dxa" w:w="70"/>
               <w:left w:type="dxa" w:w="120"/>
@@ -5599,9 +5644,9 @@
                 <w:rFonts w:ascii="Calibri" w:cs="Calibri" w:eastAsia="Calibri" w:hAnsi="Calibri"/>
                 <w:b w:val="false"/>
                 <w:bCs w:val="false"/>
-                <w:color w:val="233139"/>
-                <w:sz w:val="20"/>
-                <w:szCs w:val="20"/>
+                <w:color w:val="23423C"/>
+                <w:sz w:val="22"/>
+                <w:szCs w:val="22"/>
               </w:rPr>
               <w:t xml:space="preserve">01 / 406 95 95</w:t>
             </w:r>
@@ -5610,7 +5655,7 @@
         <w:tc>
           <w:tcPr>
             <w:tcW w:type="dxa" w:w="3960"/>
-            <w:shd w:fill="F1F5F3" w:color="auto" w:val="clear"/>
+            <w:shd w:fill="F1F8F4" w:color="auto" w:val="clear"/>
             <w:tcMar>
               <w:top w:type="dxa" w:w="70"/>
               <w:left w:type="dxa" w:w="120"/>
@@ -5627,9 +5672,9 @@
                 <w:rFonts w:ascii="Calibri" w:cs="Calibri" w:eastAsia="Calibri" w:hAnsi="Calibri"/>
                 <w:b w:val="false"/>
                 <w:bCs w:val="false"/>
-                <w:color w:val="233139"/>
-                <w:sz w:val="20"/>
-                <w:szCs w:val="20"/>
+                <w:color w:val="23423C"/>
+                <w:sz w:val="22"/>
+                <w:szCs w:val="22"/>
               </w:rPr>
               <w:t xml:space="preserve">Krisen · Mo–Fr (Wien)</w:t>
             </w:r>
@@ -5657,9 +5702,9 @@
                 <w:rFonts w:ascii="Calibri" w:cs="Calibri" w:eastAsia="Calibri" w:hAnsi="Calibri"/>
                 <w:b/>
                 <w:bCs/>
-                <w:color w:val="233139"/>
-                <w:sz w:val="20"/>
-                <w:szCs w:val="20"/>
+                <w:color w:val="23423C"/>
+                <w:sz w:val="22"/>
+                <w:szCs w:val="22"/>
               </w:rPr>
               <w:t xml:space="preserve">Hausärztin / Hausarzt</w:t>
             </w:r>
@@ -5685,9 +5730,9 @@
                 <w:rFonts w:ascii="Calibri" w:cs="Calibri" w:eastAsia="Calibri" w:hAnsi="Calibri"/>
                 <w:b w:val="false"/>
                 <w:bCs w:val="false"/>
-                <w:color w:val="233139"/>
-                <w:sz w:val="20"/>
-                <w:szCs w:val="20"/>
+                <w:color w:val="23423C"/>
+                <w:sz w:val="22"/>
+                <w:szCs w:val="22"/>
               </w:rPr>
               <w:t xml:space="preserve">—</w:t>
             </w:r>
@@ -5713,9 +5758,9 @@
                 <w:rFonts w:ascii="Calibri" w:cs="Calibri" w:eastAsia="Calibri" w:hAnsi="Calibri"/>
                 <w:b w:val="false"/>
                 <w:bCs w:val="false"/>
-                <w:color w:val="233139"/>
-                <w:sz w:val="20"/>
-                <w:szCs w:val="20"/>
+                <w:color w:val="23423C"/>
+                <w:sz w:val="22"/>
+                <w:szCs w:val="22"/>
               </w:rPr>
               <w:t xml:space="preserve">erste Anlaufstelle, Überweisung</w:t>
             </w:r>
@@ -5734,7 +5779,7 @@
     <w:p>
       <w:pPr>
         <w:pBdr>
-          <w:bottom w:val="single" w:color="5E6E73" w:sz="4" w:space="3"/>
+          <w:bottom w:val="single" w:color="5E736E" w:sz="4" w:space="3"/>
         </w:pBdr>
         <w:spacing w:after="200" w:before="60"/>
       </w:pPr>
@@ -5742,7 +5787,7 @@
     <w:p>
       <w:pPr>
         <w:pBdr>
-          <w:bottom w:val="single" w:color="5E6E73" w:sz="4" w:space="3"/>
+          <w:bottom w:val="single" w:color="5E736E" w:sz="4" w:space="3"/>
         </w:pBdr>
         <w:spacing w:after="200" w:before="60"/>
       </w:pPr>
@@ -5750,7 +5795,7 @@
     <w:p>
       <w:pPr>
         <w:pBdr>
-          <w:bottom w:val="single" w:color="5E6E73" w:sz="4" w:space="3"/>
+          <w:bottom w:val="single" w:color="5E736E" w:sz="4" w:space="3"/>
         </w:pBdr>
         <w:spacing w:after="200" w:before="60"/>
       </w:pPr>
@@ -5817,7 +5862,7 @@
     <w:r>
       <w:rPr>
         <w:rFonts w:ascii="Calibri" w:cs="Calibri" w:eastAsia="Calibri" w:hAnsi="Calibri"/>
-        <w:color w:val="5E6E73"/>
+        <w:color w:val="5E736E"/>
         <w:sz w:val="16"/>
         <w:szCs w:val="16"/>
       </w:rPr>
@@ -5826,7 +5871,7 @@
     <w:r>
       <w:rPr>
         <w:rFonts w:ascii="Calibri" w:cs="Calibri" w:eastAsia="Calibri" w:hAnsi="Calibri"/>
-        <w:color w:val="5E6E73"/>
+        <w:color w:val="5E736E"/>
         <w:sz w:val="16"/>
         <w:szCs w:val="16"/>
       </w:rPr>
@@ -5881,7 +5926,7 @@
   <w:p>
     <w:pPr>
       <w:pBdr>
-        <w:bottom w:val="single" w:color="DCE6E3" w:sz="4" w:space="4"/>
+        <w:bottom w:val="single" w:color="D9E9E1" w:sz="4" w:space="4"/>
       </w:pBdr>
       <w:spacing w:after="0"/>
       <w:jc w:val="right"/>
@@ -5889,7 +5934,7 @@
     <w:r>
       <w:rPr>
         <w:rFonts w:ascii="Calibri" w:cs="Calibri" w:eastAsia="Calibri" w:hAnsi="Calibri"/>
-        <w:color w:val="5E6E73"/>
+        <w:color w:val="5E736E"/>
         <w:sz w:val="16"/>
         <w:szCs w:val="16"/>
       </w:rPr>
@@ -6000,9 +6045,9 @@
     <w:rPrDefault>
       <w:rPr>
         <w:rFonts w:ascii="Calibri" w:cs="Calibri" w:eastAsia="Calibri" w:hAnsi="Calibri"/>
-        <w:color w:val="233139"/>
-        <w:sz w:val="21"/>
-        <w:szCs w:val="21"/>
+        <w:color w:val="23423C"/>
+        <w:sz w:val="23"/>
+        <w:szCs w:val="23"/>
       </w:rPr>
     </w:rPrDefault>
     <w:pPrDefault/>
@@ -6189,7 +6234,7 @@
       <w:rFonts w:ascii="Cambria" w:cs="Cambria" w:eastAsia="Cambria" w:hAnsi="Cambria"/>
       <w:b/>
       <w:bCs/>
-      <w:color w:val="2E4A52"/>
+      <w:color w:val="2C7A6B"/>
       <w:sz w:val="52"/>
       <w:szCs w:val="52"/>
     </w:rPr>
@@ -6205,7 +6250,7 @@
       <w:rFonts w:ascii="Cambria" w:cs="Cambria" w:eastAsia="Cambria" w:hAnsi="Cambria"/>
       <w:i/>
       <w:iCs/>
-      <w:color w:val="3F7C79"/>
+      <w:color w:val="2E9284"/>
       <w:sz w:val="26"/>
       <w:szCs w:val="26"/>
     </w:rPr>
@@ -6218,7 +6263,7 @@
     <w:pPr>
       <w:keepNext/>
       <w:pBdr>
-        <w:bottom w:val="single" w:color="DCE6E3" w:sz="8" w:space="6"/>
+        <w:bottom w:val="single" w:color="D9E9E1" w:sz="8" w:space="6"/>
       </w:pBdr>
       <w:spacing w:after="140" w:before="320"/>
     </w:pPr>
@@ -6226,9 +6271,9 @@
       <w:rFonts w:ascii="Cambria" w:cs="Cambria" w:eastAsia="Cambria" w:hAnsi="Cambria"/>
       <w:b/>
       <w:bCs/>
-      <w:color w:val="2E4A52"/>
-      <w:sz w:val="30"/>
-      <w:szCs w:val="30"/>
+      <w:color w:val="2C7A6B"/>
+      <w:sz w:val="33"/>
+      <w:szCs w:val="33"/>
     </w:rPr>
   </w:style>
   <w:style w:type="paragraph" w:styleId="Heading2">
@@ -6244,9 +6289,9 @@
       <w:rFonts w:ascii="Cambria" w:cs="Cambria" w:eastAsia="Cambria" w:hAnsi="Cambria"/>
       <w:b/>
       <w:bCs/>
-      <w:color w:val="3F7C79"/>
-      <w:sz w:val="24"/>
-      <w:szCs w:val="24"/>
+      <w:color w:val="2E9284"/>
+      <w:sz w:val="27"/>
+      <w:szCs w:val="27"/>
     </w:rPr>
   </w:style>
   <w:style w:type="paragraph" w:styleId="Heading3">
@@ -6262,9 +6307,9 @@
       <w:rFonts w:ascii="Cambria" w:cs="Cambria" w:eastAsia="Cambria" w:hAnsi="Cambria"/>
       <w:b/>
       <w:bCs/>
-      <w:color w:val="B9793B"/>
-      <w:sz w:val="21"/>
-      <w:szCs w:val="21"/>
+      <w:color w:val="BC722A"/>
+      <w:sz w:val="23"/>
+      <w:szCs w:val="23"/>
     </w:rPr>
   </w:style>
 </w:styles>

</xml_diff>